<commit_message>
Portal: módulo Crew (inglês) e o ato do Crew no guia do apresentador
- Crew: visão geral, manual do usuário (trabalhador, encarregado e escritório,
  com 18 capturas), regras de negócio CRW-nnn, perfis e permissões, o que é
  simulado no protótipo.
- Guia do apresentador: ato 6 (Crew: ponto da equipe, Agora, timesheets,
  custos com a projeção) e ato 7 (demais módulos).
- tools/capturas-portal.mjs: capturas do Crew (horários fixos: 6h50 antes da
  entrada e 16h30) e opção --so=crew para refazer só uma parte.
- App: "≈ 1.4 mi percorridos" no mapa do dia passa pelo tr() ("traveled").
- Cache v41.

Co-Authored-By: Claude Opus 5.5 <noreply@anthropic.com>
Claude-Session: https://claude.ai/code/session_01Ep8bJsuQq2bqGePCMzzux2
</commit_message>
<xml_diff>
--- a/portal/files/KORbuild - Presenters guide.docx
+++ b/portal/files/KORbuild - Presenters guide.docx
@@ -34,21 +34,21 @@
           <w:b w:val="0"/>
           <w:i w:val="0"/>
         </w:rPr>
-        <w:t xml:space="preserve">This guide is for the person who will present KORbuild to a customer. You do not need to know the system beforehand: follow the order below, sign in with the users indicated, and use the "what to say" boxes as your script. A full presentation of Daily takes about </w:t>
+        <w:t xml:space="preserve">This guide is for the person who will present KORbuild to a customer. You do not need to know the system beforehand: follow the order below, sign in with the users indicated, and use the "what to say" boxes as your script. A presentation of Daily and Crew takes about </w:t>
       </w:r>
       <w:r>
         <w:rPr>
           <w:b/>
           <w:i w:val="0"/>
         </w:rPr>
-        <w:t>15 minutes</w:t>
+        <w:t>25 minutes</w:t>
       </w:r>
       <w:r>
         <w:rPr>
           <w:b w:val="0"/>
           <w:i w:val="0"/>
         </w:rPr>
-        <w:t>; with questions, plan for 30.</w:t>
+        <w:t>; with questions, plan for 40.</w:t>
       </w:r>
     </w:p>
     <w:p>
@@ -2483,49 +2483,132 @@
           <w:b w:val="0"/>
           <w:i w:val="0"/>
         </w:rPr>
-        <w:t>Act 6 — The other modules (optional, 5 min each)</w:t>
+        <w:t>Act 6 — Crew: the time clock and labor cost (6 min)</w:t>
       </w:r>
     </w:p>
     <w:p>
+      <w:pPr>
+        <w:pStyle w:val="ListNumber"/>
+        <w:numPr>
+          <w:ilvl w:val="0"/>
+          <w:numId w:val="16"/>
+        </w:numPr>
+      </w:pPr>
       <w:r>
         <w:rPr>
           <w:b w:val="0"/>
           <w:i w:val="0"/>
         </w:rPr>
-        <w:t>Detailed scripts for Crew, Measure and Settings will be added to this guide. Meanwhile, the highlights:</w:t>
+        <w:t xml:space="preserve">Sign in as </w:t>
       </w:r>
-    </w:p>
-    <w:p>
-      <w:pPr>
-        <w:pStyle w:val="ListBullet"/>
-      </w:pPr>
       <w:r>
         <w:rPr>
           <w:b/>
           <w:i w:val="0"/>
         </w:rPr>
-        <w:t>Crew</w:t>
+        <w:t>Diego Santos</w:t>
       </w:r>
       <w:r>
         <w:rPr>
           <w:b w:val="0"/>
           <w:i w:val="0"/>
         </w:rPr>
-        <w:t xml:space="preserve"> — sign in as </w:t>
+        <w:t xml:space="preserve"> (Worker). KORbuild opens straight on </w:t>
       </w:r>
       <w:r>
         <w:rPr>
           <w:b/>
           <w:i w:val="0"/>
         </w:rPr>
-        <w:t>Carlos</w:t>
+        <w:t>My time clock</w:t>
       </w:r>
       <w:r>
         <w:rPr>
           <w:b w:val="0"/>
           <w:i w:val="0"/>
         </w:rPr>
-        <w:t xml:space="preserve">, open Crew › </w:t>
+        <w:t>: one big button with what fits now.</w:t>
+      </w:r>
+    </w:p>
+    <w:p>
+      <w:pPr>
+        <w:jc w:val="center"/>
+      </w:pPr>
+      <w:r>
+        <w:drawing>
+          <wp:inline xmlns:a="http://schemas.openxmlformats.org/drawingml/2006/main" xmlns:pic="http://schemas.openxmlformats.org/drawingml/2006/picture">
+            <wp:extent cx="2520000" cy="5453538"/>
+            <wp:docPr id="7" name="Picture 7"/>
+            <wp:cNvGraphicFramePr>
+              <a:graphicFrameLocks noChangeAspect="1"/>
+            </wp:cNvGraphicFramePr>
+            <a:graphic>
+              <a:graphicData uri="http://schemas.openxmlformats.org/drawingml/2006/picture">
+                <pic:pic>
+                  <pic:nvPicPr>
+                    <pic:cNvPr id="0" name="crew-my-clock-before-mobile.png"/>
+                    <pic:cNvPicPr/>
+                  </pic:nvPicPr>
+                  <pic:blipFill>
+                    <a:blip r:embed="rId15"/>
+                    <a:stretch>
+                      <a:fillRect/>
+                    </a:stretch>
+                  </pic:blipFill>
+                  <pic:spPr>
+                    <a:xfrm>
+                      <a:off x="0" y="0"/>
+                      <a:ext cx="2520000" cy="5453538"/>
+                    </a:xfrm>
+                    <a:prstGeom prst="rect"/>
+                  </pic:spPr>
+                </pic:pic>
+              </a:graphicData>
+            </a:graphic>
+          </wp:inline>
+        </w:drawing>
+      </w:r>
+    </w:p>
+    <w:p>
+      <w:pPr>
+        <w:jc w:val="center"/>
+      </w:pPr>
+      <w:r>
+        <w:rPr>
+          <w:b w:val="0"/>
+          <w:i/>
+        </w:rPr>
+        <w:t>My time clock: the worker sees only his own time clock</w:t>
+      </w:r>
+    </w:p>
+    <w:p>
+      <w:pPr>
+        <w:pStyle w:val="ListNumber"/>
+        <w:numPr>
+          <w:ilvl w:val="0"/>
+          <w:numId w:val="16"/>
+        </w:numPr>
+      </w:pPr>
+      <w:r>
+        <w:rPr>
+          <w:b w:val="0"/>
+          <w:i w:val="0"/>
+        </w:rPr>
+        <w:t xml:space="preserve">Sign in as </w:t>
+      </w:r>
+      <w:r>
+        <w:rPr>
+          <w:b/>
+          <w:i w:val="0"/>
+        </w:rPr>
+        <w:t>Carlos Mendes</w:t>
+      </w:r>
+      <w:r>
+        <w:rPr>
+          <w:b w:val="0"/>
+          <w:i w:val="0"/>
+        </w:rPr>
+        <w:t xml:space="preserve"> (Foreman), open </w:t>
       </w:r>
       <w:r>
         <w:rPr>
@@ -2539,14 +2622,181 @@
           <w:b w:val="0"/>
           <w:i w:val="0"/>
         </w:rPr>
-        <w:t xml:space="preserve">: clock in the whole crew at once, with GPS and the job's geofence. Then as </w:t>
+        <w:t xml:space="preserve">: the </w:t>
       </w:r>
       <w:r>
         <w:rPr>
           <w:b/>
           <w:i w:val="0"/>
         </w:rPr>
-        <w:t>Ana</w:t>
+        <w:t>Crew time clock</w:t>
+      </w:r>
+      <w:r>
+        <w:rPr>
+          <w:b w:val="0"/>
+          <w:i w:val="0"/>
+        </w:rPr>
+        <w:t xml:space="preserve">. Tap </w:t>
+      </w:r>
+      <w:r>
+        <w:rPr>
+          <w:b/>
+          <w:i w:val="0"/>
+        </w:rPr>
+        <w:t>Select all</w:t>
+      </w:r>
+      <w:r>
+        <w:rPr>
+          <w:b w:val="0"/>
+          <w:i w:val="0"/>
+        </w:rPr>
+        <w:t xml:space="preserve"> and </w:t>
+      </w:r>
+      <w:r>
+        <w:rPr>
+          <w:b/>
+          <w:i w:val="0"/>
+        </w:rPr>
+        <w:t>Clock in (6)</w:t>
+      </w:r>
+      <w:r>
+        <w:rPr>
+          <w:b w:val="0"/>
+          <w:i w:val="0"/>
+        </w:rPr>
+        <w:t xml:space="preserve">: the window shows the distance to the job and </w:t>
+      </w:r>
+      <w:r>
+        <w:rPr>
+          <w:b w:val="0"/>
+          <w:i/>
+        </w:rPr>
+        <w:t>inside the geofence ✓</w:t>
+      </w:r>
+      <w:r>
+        <w:rPr>
+          <w:b w:val="0"/>
+          <w:i w:val="0"/>
+        </w:rPr>
+        <w:t>. Choose the cost code and confirm.</w:t>
+      </w:r>
+    </w:p>
+    <w:p>
+      <w:pPr>
+        <w:jc w:val="center"/>
+      </w:pPr>
+      <w:r>
+        <w:drawing>
+          <wp:inline xmlns:a="http://schemas.openxmlformats.org/drawingml/2006/main" xmlns:pic="http://schemas.openxmlformats.org/drawingml/2006/picture">
+            <wp:extent cx="2520000" cy="3644746"/>
+            <wp:docPr id="8" name="Picture 8"/>
+            <wp:cNvGraphicFramePr>
+              <a:graphicFrameLocks noChangeAspect="1"/>
+            </wp:cNvGraphicFramePr>
+            <a:graphic>
+              <a:graphicData uri="http://schemas.openxmlformats.org/drawingml/2006/picture">
+                <pic:pic>
+                  <pic:nvPicPr>
+                    <pic:cNvPr id="0" name="crew-team-clock-in-dialog-mobile.png"/>
+                    <pic:cNvPicPr/>
+                  </pic:nvPicPr>
+                  <pic:blipFill>
+                    <a:blip r:embed="rId16"/>
+                    <a:stretch>
+                      <a:fillRect/>
+                    </a:stretch>
+                  </pic:blipFill>
+                  <pic:spPr>
+                    <a:xfrm>
+                      <a:off x="0" y="0"/>
+                      <a:ext cx="2520000" cy="3644746"/>
+                    </a:xfrm>
+                    <a:prstGeom prst="rect"/>
+                  </pic:spPr>
+                </pic:pic>
+              </a:graphicData>
+            </a:graphic>
+          </wp:inline>
+        </w:drawing>
+      </w:r>
+    </w:p>
+    <w:p>
+      <w:pPr>
+        <w:jc w:val="center"/>
+      </w:pPr>
+      <w:r>
+        <w:rPr>
+          <w:b w:val="0"/>
+          <w:i/>
+        </w:rPr>
+        <w:t>Clocking in the whole crew from one phone</w:t>
+      </w:r>
+    </w:p>
+    <w:p>
+      <w:pPr>
+        <w:pStyle w:val="ListNumber"/>
+        <w:numPr>
+          <w:ilvl w:val="0"/>
+          <w:numId w:val="16"/>
+        </w:numPr>
+      </w:pPr>
+      <w:r>
+        <w:rPr>
+          <w:b w:val="0"/>
+          <w:i w:val="0"/>
+        </w:rPr>
+        <w:t xml:space="preserve">Show </w:t>
+      </w:r>
+      <w:r>
+        <w:rPr>
+          <w:b/>
+          <w:i w:val="0"/>
+        </w:rPr>
+        <w:t>Switch job</w:t>
+      </w:r>
+      <w:r>
+        <w:rPr>
+          <w:b w:val="0"/>
+          <w:i w:val="0"/>
+        </w:rPr>
+        <w:t>: travel to the other job is paid time.</w:t>
+      </w:r>
+    </w:p>
+    <w:p>
+      <w:pPr>
+        <w:pStyle w:val="ListNumber"/>
+        <w:numPr>
+          <w:ilvl w:val="0"/>
+          <w:numId w:val="16"/>
+        </w:numPr>
+      </w:pPr>
+      <w:r>
+        <w:rPr>
+          <w:b w:val="0"/>
+          <w:i w:val="0"/>
+        </w:rPr>
+        <w:t xml:space="preserve">Sign in as </w:t>
+      </w:r>
+      <w:r>
+        <w:rPr>
+          <w:b/>
+          <w:i w:val="0"/>
+        </w:rPr>
+        <w:t>Ana Ribeiro</w:t>
+      </w:r>
+      <w:r>
+        <w:rPr>
+          <w:b w:val="0"/>
+          <w:i w:val="0"/>
+        </w:rPr>
+        <w:t xml:space="preserve"> (Admin), open </w:t>
+      </w:r>
+      <w:r>
+        <w:rPr>
+          <w:b/>
+          <w:i w:val="0"/>
+        </w:rPr>
+        <w:t>Crew</w:t>
       </w:r>
       <w:r>
         <w:rPr>
@@ -2567,7 +2817,37 @@
           <w:b w:val="0"/>
           <w:i w:val="0"/>
         </w:rPr>
-        <w:t xml:space="preserve"> (who is working where), </w:t>
+        <w:t xml:space="preserve"> shows who is working on each job and the </w:t>
+      </w:r>
+      <w:r>
+        <w:rPr>
+          <w:b/>
+          <w:i w:val="0"/>
+        </w:rPr>
+        <w:t>off-site punches to review</w:t>
+      </w:r>
+      <w:r>
+        <w:rPr>
+          <w:b w:val="0"/>
+          <w:i w:val="0"/>
+        </w:rPr>
+        <w:t>.</w:t>
+      </w:r>
+    </w:p>
+    <w:p>
+      <w:pPr>
+        <w:pStyle w:val="ListNumber"/>
+        <w:numPr>
+          <w:ilvl w:val="0"/>
+          <w:numId w:val="16"/>
+        </w:numPr>
+      </w:pPr>
+      <w:r>
+        <w:rPr>
+          <w:b w:val="0"/>
+          <w:i w:val="0"/>
+        </w:rPr>
+        <w:t xml:space="preserve">Open </w:t>
       </w:r>
       <w:r>
         <w:rPr>
@@ -2581,7 +2861,65 @@
           <w:b w:val="0"/>
           <w:i w:val="0"/>
         </w:rPr>
-        <w:t xml:space="preserve"> and </w:t>
+        <w:t xml:space="preserve">, go to the previous week: hours per day, overtime, cost and status. Open </w:t>
+      </w:r>
+      <w:r>
+        <w:rPr>
+          <w:b/>
+          <w:i w:val="0"/>
+        </w:rPr>
+        <w:t>Roberto Lima</w:t>
+      </w:r>
+      <w:r>
+        <w:rPr>
+          <w:b w:val="0"/>
+          <w:i w:val="0"/>
+        </w:rPr>
+        <w:t xml:space="preserve"> (awaiting approval) and show </w:t>
+      </w:r>
+      <w:r>
+        <w:rPr>
+          <w:b/>
+          <w:i w:val="0"/>
+        </w:rPr>
+        <w:t>Edit</w:t>
+      </w:r>
+      <w:r>
+        <w:rPr>
+          <w:b w:val="0"/>
+          <w:i w:val="0"/>
+        </w:rPr>
+        <w:t xml:space="preserve"> (a new punch with a reason — the original stays) and </w:t>
+      </w:r>
+      <w:r>
+        <w:rPr>
+          <w:b/>
+          <w:i w:val="0"/>
+        </w:rPr>
+        <w:t>Approve week</w:t>
+      </w:r>
+      <w:r>
+        <w:rPr>
+          <w:b w:val="0"/>
+          <w:i w:val="0"/>
+        </w:rPr>
+        <w:t>.</w:t>
+      </w:r>
+    </w:p>
+    <w:p>
+      <w:pPr>
+        <w:pStyle w:val="ListNumber"/>
+        <w:numPr>
+          <w:ilvl w:val="0"/>
+          <w:numId w:val="16"/>
+        </w:numPr>
+      </w:pPr>
+      <w:r>
+        <w:rPr>
+          <w:b w:val="0"/>
+          <w:i w:val="0"/>
+        </w:rPr>
+        <w:t xml:space="preserve">Open </w:t>
       </w:r>
       <w:r>
         <w:rPr>
@@ -2595,7 +2933,154 @@
           <w:b w:val="0"/>
           <w:i w:val="0"/>
         </w:rPr>
-        <w:t xml:space="preserve"> by job, with the forecast to completion.</w:t>
+        <w:t xml:space="preserve">: the </w:t>
+      </w:r>
+      <w:r>
+        <w:rPr>
+          <w:b/>
+          <w:i w:val="0"/>
+        </w:rPr>
+        <w:t>Atlantic Tower</w:t>
+      </w:r>
+      <w:r>
+        <w:rPr>
+          <w:b w:val="0"/>
+          <w:i w:val="0"/>
+        </w:rPr>
+        <w:t xml:space="preserve"> has spent 34% of the budget and built 31% — KORbuild already shows a </w:t>
+      </w:r>
+      <w:r>
+        <w:rPr>
+          <w:b/>
+          <w:i w:val="0"/>
+        </w:rPr>
+        <w:t>projected overrun</w:t>
+      </w:r>
+      <w:r>
+        <w:rPr>
+          <w:b w:val="0"/>
+          <w:i w:val="0"/>
+        </w:rPr>
+        <w:t xml:space="preserve"> of about $111k, with a third of the schedule gone.</w:t>
+      </w:r>
+    </w:p>
+    <w:p>
+      <w:pPr>
+        <w:jc w:val="center"/>
+      </w:pPr>
+      <w:r>
+        <w:drawing>
+          <wp:inline xmlns:a="http://schemas.openxmlformats.org/drawingml/2006/main" xmlns:pic="http://schemas.openxmlformats.org/drawingml/2006/picture">
+            <wp:extent cx="5760000" cy="3625293"/>
+            <wp:docPr id="9" name="Picture 9"/>
+            <wp:cNvGraphicFramePr>
+              <a:graphicFrameLocks noChangeAspect="1"/>
+            </wp:cNvGraphicFramePr>
+            <a:graphic>
+              <a:graphicData uri="http://schemas.openxmlformats.org/drawingml/2006/picture">
+                <pic:pic>
+                  <pic:nvPicPr>
+                    <pic:cNvPr id="0" name="crew-costs-jobs.png"/>
+                    <pic:cNvPicPr/>
+                  </pic:nvPicPr>
+                  <pic:blipFill>
+                    <a:blip r:embed="rId17"/>
+                    <a:stretch>
+                      <a:fillRect/>
+                    </a:stretch>
+                  </pic:blipFill>
+                  <pic:spPr>
+                    <a:xfrm>
+                      <a:off x="0" y="0"/>
+                      <a:ext cx="5760000" cy="3625293"/>
+                    </a:xfrm>
+                    <a:prstGeom prst="rect"/>
+                  </pic:spPr>
+                </pic:pic>
+              </a:graphicData>
+            </a:graphic>
+          </wp:inline>
+        </w:drawing>
+      </w:r>
+    </w:p>
+    <w:p>
+      <w:pPr>
+        <w:jc w:val="center"/>
+      </w:pPr>
+      <w:r>
+        <w:rPr>
+          <w:b w:val="0"/>
+          <w:i/>
+        </w:rPr>
+        <w:t>Labor cost by job, with the forecast to completion</w:t>
+      </w:r>
+    </w:p>
+    <w:p>
+      <w:pPr>
+        <w:shd w:val="clear" w:color="auto" w:fill="EEF1F5"/>
+      </w:pPr>
+      <w:r>
+        <w:rPr>
+          <w:b/>
+          <w:i w:val="0"/>
+        </w:rPr>
+        <w:t>What to say</w:t>
+      </w:r>
+    </w:p>
+    <w:p>
+      <w:pPr>
+        <w:shd w:val="clear" w:color="auto" w:fill="EEF1F5"/>
+      </w:pPr>
+      <w:r>
+        <w:rPr>
+          <w:b w:val="0"/>
+          <w:i w:val="0"/>
+        </w:rPr>
+        <w:t>"The foreman clocks in the whole crew in seconds, with GPS and the job's geofence — no paper card, no buddy punching. The office approves the week and exports it to payroll. And the owner sees, a third of the way into the job, that labor is going to run over — while there is still time to act."</w:t>
+      </w:r>
+    </w:p>
+    <w:p>
+      <w:r>
+        <w:rPr>
+          <w:b w:val="0"/>
+          <w:i w:val="0"/>
+        </w:rPr>
+        <w:t xml:space="preserve">Full details: </w:t>
+      </w:r>
+      <w:r>
+        <w:rPr>
+          <w:b w:val="0"/>
+          <w:i w:val="0"/>
+        </w:rPr>
+        <w:t>Crew user manual</w:t>
+      </w:r>
+      <w:r>
+        <w:rPr>
+          <w:b w:val="0"/>
+          <w:i w:val="0"/>
+        </w:rPr>
+        <w:t>.</w:t>
+      </w:r>
+    </w:p>
+    <w:p>
+      <w:pPr>
+        <w:pStyle w:val="Heading2"/>
+      </w:pPr>
+      <w:r>
+        <w:rPr>
+          <w:b w:val="0"/>
+          <w:i w:val="0"/>
+        </w:rPr>
+        <w:t>Act 7 — The other modules (optional)</w:t>
+      </w:r>
+    </w:p>
+    <w:p>
+      <w:r>
+        <w:rPr>
+          <w:b w:val="0"/>
+          <w:i w:val="0"/>
+        </w:rPr>
+        <w:t>Detailed scripts for Measure and Settings will be added to this guide. Meanwhile, the highlights:</w:t>
       </w:r>
     </w:p>
     <w:p>
@@ -2704,6 +3189,39 @@
           <w:i w:val="0"/>
         </w:rPr>
         <w:t>: Gantt chart, baseline, progress from the daily reports, export to Excel and publish to the GC.</w:t>
+      </w:r>
+    </w:p>
+    <w:p>
+      <w:pPr>
+        <w:pStyle w:val="ListBullet"/>
+      </w:pPr>
+      <w:r>
+        <w:rPr>
+          <w:b/>
+          <w:i w:val="0"/>
+        </w:rPr>
+        <w:t>Settings</w:t>
+      </w:r>
+      <w:r>
+        <w:rPr>
+          <w:b w:val="0"/>
+          <w:i w:val="0"/>
+        </w:rPr>
+        <w:t xml:space="preserve"> — as </w:t>
+      </w:r>
+      <w:r>
+        <w:rPr>
+          <w:b/>
+          <w:i w:val="0"/>
+        </w:rPr>
+        <w:t>Ana</w:t>
+      </w:r>
+      <w:r>
+        <w:rPr>
+          <w:b w:val="0"/>
+          <w:i w:val="0"/>
+        </w:rPr>
+        <w:t>: employees with hourly rate history, labor burden, work rules, jobs, users and access roles, audit log.</w:t>
       </w:r>
     </w:p>
     <w:p>
@@ -3327,6 +3845,12 @@
       <w:startOverride w:val="1"/>
     </w:lvlOverride>
   </w:num>
+  <w:num w:numId="16">
+    <w:abstractNumId w:val="7"/>
+    <w:lvlOverride w:ilvl="0">
+      <w:startOverride w:val="1"/>
+    </w:lvlOverride>
+  </w:num>
 </w:numbering>
 </file>
 

</xml_diff>

<commit_message>
Portal: "How KORbuild is organized" e textos com construtora e prestadoras
- Página nova: os dois tipos de cliente, quem cadastra o quê, o que cada
  empresa vê da outra (aprovação pela construtora, nomes e horas sem
  valores) e as três empresas da demonstração
- Guia do apresentador: usuários por empresa, ato 1 com o Tom, ato 4 da
  construtora (prestadoras na obra e aprovação), Crew com a Sandra,
  perguntas novas dos clientes
- Daily: quem aprova (DLY-055 a 058), farol por prestadora e visão
  gerencial (DLY-072, 073), manual e perfis; Crew: CRW-062 e 063
- Capturas refeitas, com a obra da construtora e a prestadora esperando a
  aprovação; imagem de celular não estoura a largura dentro de lista

Co-Authored-By: Claude Opus 5.5 <noreply@anthropic.com>
Claude-Session: https://claude.ai/code/session_01Ep8bJsuQq2bqGePCMzzux2
</commit_message>
<xml_diff>
--- a/portal/files/KORbuild - Presenters guide.docx
+++ b/portal/files/KORbuild - Presenters guide.docx
@@ -410,21 +410,114 @@
           <w:b w:val="0"/>
           <w:i w:val="0"/>
         </w:rPr>
-        <w:t xml:space="preserve"> (GC) and the </w:t>
+        <w:t xml:space="preserve"> (GC), who </w:t>
       </w:r>
       <w:r>
         <w:rPr>
           <w:b/>
           <w:i w:val="0"/>
         </w:rPr>
-        <w:t>trade contractor</w:t>
+        <w:t>manages</w:t>
       </w:r>
       <w:r>
         <w:rPr>
           <w:b w:val="0"/>
           <w:i w:val="0"/>
         </w:rPr>
-        <w:t xml:space="preserve"> (sub) that the GC hires. The prototype has one company of each, so you can show both points of view.</w:t>
+        <w:t xml:space="preserve"> the job, and the </w:t>
+      </w:r>
+      <w:r>
+        <w:rPr>
+          <w:b/>
+          <w:i w:val="0"/>
+        </w:rPr>
+        <w:t>subcontractors</w:t>
+      </w:r>
+      <w:r>
+        <w:rPr>
+          <w:b w:val="0"/>
+          <w:i w:val="0"/>
+        </w:rPr>
+        <w:t xml:space="preserve"> (subs) who </w:t>
+      </w:r>
+      <w:r>
+        <w:rPr>
+          <w:b/>
+          <w:i w:val="0"/>
+        </w:rPr>
+        <w:t>do the work</w:t>
+      </w:r>
+      <w:r>
+        <w:rPr>
+          <w:b w:val="0"/>
+          <w:i w:val="0"/>
+        </w:rPr>
+        <w:t xml:space="preserve">. Each sub keeps its own daily reports, time clock and schedule; the GC approves the reports and sees who is on site and the hours — never what the sub pays its people. A sub can also be a customer on its own, with jobs straight from the owner. Read </w:t>
+      </w:r>
+      <w:r>
+        <w:rPr>
+          <w:b w:val="0"/>
+          <w:i w:val="0"/>
+        </w:rPr>
+        <w:t>How KORbuild is organized</w:t>
+      </w:r>
+      <w:r>
+        <w:rPr>
+          <w:b w:val="0"/>
+          <w:i w:val="0"/>
+        </w:rPr>
+        <w:t xml:space="preserve"> before the meeting: it takes three minutes.</w:t>
+      </w:r>
+    </w:p>
+    <w:p>
+      <w:r>
+        <w:rPr>
+          <w:b w:val="0"/>
+          <w:i w:val="0"/>
+        </w:rPr>
+        <w:t xml:space="preserve">The prototype has three companies: </w:t>
+      </w:r>
+      <w:r>
+        <w:rPr>
+          <w:b/>
+          <w:i w:val="0"/>
+        </w:rPr>
+        <w:t>Example Builders</w:t>
+      </w:r>
+      <w:r>
+        <w:rPr>
+          <w:b w:val="0"/>
+          <w:i w:val="0"/>
+        </w:rPr>
+        <w:t xml:space="preserve"> (the GC), </w:t>
+      </w:r>
+      <w:r>
+        <w:rPr>
+          <w:b/>
+          <w:i w:val="0"/>
+        </w:rPr>
+        <w:t>Ridgeline Concrete &amp; Masonry</w:t>
+      </w:r>
+      <w:r>
+        <w:rPr>
+          <w:b w:val="0"/>
+          <w:i w:val="0"/>
+        </w:rPr>
+        <w:t xml:space="preserve"> and </w:t>
+      </w:r>
+      <w:r>
+        <w:rPr>
+          <w:b/>
+          <w:i w:val="0"/>
+        </w:rPr>
+        <w:t>Northfield Framing &amp; Siding</w:t>
+      </w:r>
+      <w:r>
+        <w:rPr>
+          <w:b w:val="0"/>
+          <w:i w:val="0"/>
+        </w:rPr>
+        <w:t xml:space="preserve"> (two subs).</w:t>
       </w:r>
     </w:p>
     <w:p>
@@ -660,7 +753,7 @@
           <w:b w:val="0"/>
           <w:i w:val="0"/>
         </w:rPr>
-        <w:t xml:space="preserve"> (no server yet). Two consequences: what you do on the phone does not appear on the computer, and two people never see each other's changes. To show the field → office flow, switch users </w:t>
+        <w:t xml:space="preserve"> (no server yet). Two consequences: what you do on the phone does not appear on the computer, and two people never see each other's changes. To show the field → GC flow, switch users </w:t>
       </w:r>
       <w:r>
         <w:rPr>
@@ -880,80 +973,6 @@
                 <w:i w:val="0"/>
                 <w:sz w:val="18"/>
               </w:rPr>
-              <w:t>Carlos Mendes</w:t>
-            </w:r>
-            <w:r>
-              <w:rPr>
-                <w:b w:val="0"/>
-                <w:i w:val="0"/>
-                <w:sz w:val="18"/>
-              </w:rPr>
-              <w:t xml:space="preserve"> · carlos@examplebuilders.com</w:t>
-            </w:r>
-          </w:p>
-        </w:tc>
-        <w:tc>
-          <w:tcPr>
-            <w:tcW w:type="dxa" w:w="2436"/>
-          </w:tcPr>
-          <w:p>
-            <w:r/>
-            <w:r>
-              <w:rPr>
-                <w:b w:val="0"/>
-                <w:i w:val="0"/>
-                <w:sz w:val="18"/>
-              </w:rPr>
-              <w:t>Example Builders (GC)</w:t>
-            </w:r>
-          </w:p>
-        </w:tc>
-        <w:tc>
-          <w:tcPr>
-            <w:tcW w:type="dxa" w:w="2436"/>
-          </w:tcPr>
-          <w:p>
-            <w:r/>
-            <w:r>
-              <w:rPr>
-                <w:b w:val="0"/>
-                <w:i w:val="0"/>
-                <w:sz w:val="18"/>
-              </w:rPr>
-              <w:t>Foreman</w:t>
-            </w:r>
-          </w:p>
-        </w:tc>
-        <w:tc>
-          <w:tcPr>
-            <w:tcW w:type="dxa" w:w="2436"/>
-          </w:tcPr>
-          <w:p>
-            <w:r/>
-            <w:r>
-              <w:rPr>
-                <w:b w:val="0"/>
-                <w:i w:val="0"/>
-                <w:sz w:val="18"/>
-              </w:rPr>
-              <w:t>The phone: daily report, crew time clock</w:t>
-            </w:r>
-          </w:p>
-        </w:tc>
-      </w:tr>
-      <w:tr>
-        <w:tc>
-          <w:tcPr>
-            <w:tcW w:type="dxa" w:w="2436"/>
-          </w:tcPr>
-          <w:p>
-            <w:r/>
-            <w:r>
-              <w:rPr>
-                <w:b/>
-                <w:i w:val="0"/>
-                <w:sz w:val="18"/>
-              </w:rPr>
               <w:t>Ana Ribeiro</w:t>
             </w:r>
             <w:r>
@@ -1010,7 +1029,81 @@
                 <w:i w:val="0"/>
                 <w:sz w:val="18"/>
               </w:rPr>
-              <w:t>The office: dashboard, approvals, client link, settings</w:t>
+              <w:t>The general contractor: dashboard of all subs, approvals, jobs with the people on site, client link</w:t>
+            </w:r>
+          </w:p>
+        </w:tc>
+      </w:tr>
+      <w:tr>
+        <w:tc>
+          <w:tcPr>
+            <w:tcW w:type="dxa" w:w="2436"/>
+          </w:tcPr>
+          <w:p>
+            <w:r/>
+            <w:r>
+              <w:rPr>
+                <w:b/>
+                <w:i w:val="0"/>
+                <w:sz w:val="18"/>
+              </w:rPr>
+              <w:t>Carlos Mendes</w:t>
+            </w:r>
+            <w:r>
+              <w:rPr>
+                <w:b w:val="0"/>
+                <w:i w:val="0"/>
+                <w:sz w:val="18"/>
+              </w:rPr>
+              <w:t xml:space="preserve"> · carlos@ridgelinemasonry.com</w:t>
+            </w:r>
+          </w:p>
+        </w:tc>
+        <w:tc>
+          <w:tcPr>
+            <w:tcW w:type="dxa" w:w="2436"/>
+          </w:tcPr>
+          <w:p>
+            <w:r/>
+            <w:r>
+              <w:rPr>
+                <w:b w:val="0"/>
+                <w:i w:val="0"/>
+                <w:sz w:val="18"/>
+              </w:rPr>
+              <w:t>Ridgeline (sub)</w:t>
+            </w:r>
+          </w:p>
+        </w:tc>
+        <w:tc>
+          <w:tcPr>
+            <w:tcW w:type="dxa" w:w="2436"/>
+          </w:tcPr>
+          <w:p>
+            <w:r/>
+            <w:r>
+              <w:rPr>
+                <w:b w:val="0"/>
+                <w:i w:val="0"/>
+                <w:sz w:val="18"/>
+              </w:rPr>
+              <w:t>Foreman</w:t>
+            </w:r>
+          </w:p>
+        </w:tc>
+        <w:tc>
+          <w:tcPr>
+            <w:tcW w:type="dxa" w:w="2436"/>
+          </w:tcPr>
+          <w:p>
+            <w:r/>
+            <w:r>
+              <w:rPr>
+                <w:b w:val="0"/>
+                <w:i w:val="0"/>
+                <w:sz w:val="18"/>
+              </w:rPr>
+              <w:t>The phone: daily report, crew time clock</w:t>
             </w:r>
           </w:p>
         </w:tc>
@@ -1036,7 +1129,7 @@
                 <w:i w:val="0"/>
                 <w:sz w:val="18"/>
               </w:rPr>
-              <w:t xml:space="preserve"> · diego@examplebuilders.com</w:t>
+              <w:t xml:space="preserve"> · diego@ridgelinemasonry.com</w:t>
             </w:r>
           </w:p>
         </w:tc>
@@ -1052,7 +1145,7 @@
                 <w:i w:val="0"/>
                 <w:sz w:val="18"/>
               </w:rPr>
-              <w:t>Example Builders (GC)</w:t>
+              <w:t>Ridgeline (sub)</w:t>
             </w:r>
           </w:p>
         </w:tc>
@@ -1102,7 +1195,7 @@
                 <w:i w:val="0"/>
                 <w:sz w:val="18"/>
               </w:rPr>
-              <w:t>Tom Reilly</w:t>
+              <w:t>Sandra Lopes</w:t>
             </w:r>
             <w:r>
               <w:rPr>
@@ -1110,7 +1203,7 @@
                 <w:i w:val="0"/>
                 <w:sz w:val="18"/>
               </w:rPr>
-              <w:t xml:space="preserve"> · tom@northfieldframing.com</w:t>
+              <w:t xml:space="preserve"> · sandra@ridgelinemasonry.com</w:t>
             </w:r>
           </w:p>
         </w:tc>
@@ -1126,7 +1219,7 @@
                 <w:i w:val="0"/>
                 <w:sz w:val="18"/>
               </w:rPr>
-              <w:t>Northfield Framing &amp; Siding (sub)</w:t>
+              <w:t>Ridgeline (sub)</w:t>
             </w:r>
           </w:p>
         </w:tc>
@@ -1158,7 +1251,81 @@
                 <w:i w:val="0"/>
                 <w:sz w:val="18"/>
               </w:rPr>
-              <w:t>The trade contractor: Measure, job schedule, pricing</w:t>
+              <w:t>The sub's office: timesheets, labor cost, employees, labor burden</w:t>
+            </w:r>
+          </w:p>
+        </w:tc>
+      </w:tr>
+      <w:tr>
+        <w:tc>
+          <w:tcPr>
+            <w:tcW w:type="dxa" w:w="2436"/>
+          </w:tcPr>
+          <w:p>
+            <w:r/>
+            <w:r>
+              <w:rPr>
+                <w:b/>
+                <w:i w:val="0"/>
+                <w:sz w:val="18"/>
+              </w:rPr>
+              <w:t>Tom Reilly</w:t>
+            </w:r>
+            <w:r>
+              <w:rPr>
+                <w:b w:val="0"/>
+                <w:i w:val="0"/>
+                <w:sz w:val="18"/>
+              </w:rPr>
+              <w:t xml:space="preserve"> · tom@northfieldframing.com</w:t>
+            </w:r>
+          </w:p>
+        </w:tc>
+        <w:tc>
+          <w:tcPr>
+            <w:tcW w:type="dxa" w:w="2436"/>
+          </w:tcPr>
+          <w:p>
+            <w:r/>
+            <w:r>
+              <w:rPr>
+                <w:b w:val="0"/>
+                <w:i w:val="0"/>
+                <w:sz w:val="18"/>
+              </w:rPr>
+              <w:t>Northfield (sub)</w:t>
+            </w:r>
+          </w:p>
+        </w:tc>
+        <w:tc>
+          <w:tcPr>
+            <w:tcW w:type="dxa" w:w="2436"/>
+          </w:tcPr>
+          <w:p>
+            <w:r/>
+            <w:r>
+              <w:rPr>
+                <w:b w:val="0"/>
+                <w:i w:val="0"/>
+                <w:sz w:val="18"/>
+              </w:rPr>
+              <w:t>Admin</w:t>
+            </w:r>
+          </w:p>
+        </w:tc>
+        <w:tc>
+          <w:tcPr>
+            <w:tcW w:type="dxa" w:w="2436"/>
+          </w:tcPr>
+          <w:p>
+            <w:r/>
+            <w:r>
+              <w:rPr>
+                <w:b w:val="0"/>
+                <w:i w:val="0"/>
+                <w:sz w:val="18"/>
+              </w:rPr>
+              <w:t>A sub with every module: Measure, job schedule, pricing, a homeowner job of its own</w:t>
             </w:r>
           </w:p>
         </w:tc>
@@ -1200,7 +1367,7 @@
                 <w:i w:val="0"/>
                 <w:sz w:val="18"/>
               </w:rPr>
-              <w:t>Northfield Framing &amp; Siding (sub)</w:t>
+              <w:t>Northfield (sub)</w:t>
             </w:r>
           </w:p>
         </w:tc>
@@ -1274,7 +1441,7 @@
                 <w:i w:val="0"/>
                 <w:sz w:val="18"/>
               </w:rPr>
-              <w:t>Northfield Framing &amp; Siding (sub)</w:t>
+              <w:t>Northfield (sub)</w:t>
             </w:r>
           </w:p>
         </w:tc>
@@ -1306,7 +1473,7 @@
                 <w:i w:val="0"/>
                 <w:sz w:val="18"/>
               </w:rPr>
-              <w:t>The sub's field side</w:t>
+              <w:t>The second sub's field side</w:t>
             </w:r>
           </w:p>
         </w:tc>
@@ -1348,7 +1515,7 @@
                 <w:i w:val="0"/>
                 <w:sz w:val="18"/>
               </w:rPr>
-              <w:t>Northfield Framing &amp; Siding (sub)</w:t>
+              <w:t>Northfield (sub)</w:t>
             </w:r>
           </w:p>
         </w:tc>
@@ -1380,7 +1547,7 @@
                 <w:i w:val="0"/>
                 <w:sz w:val="18"/>
               </w:rPr>
-              <w:t>A worker of the sub</w:t>
+              <w:t>A worker of the second sub</w:t>
             </w:r>
           </w:p>
         </w:tc>
@@ -1454,14 +1621,14 @@
           <w:b/>
           <w:i w:val="0"/>
         </w:rPr>
-        <w:t>Ana Ribeiro</w:t>
+        <w:t>Tom Reilly</w:t>
       </w:r>
       <w:r>
         <w:rPr>
           <w:b w:val="0"/>
           <w:i w:val="0"/>
         </w:rPr>
-        <w:t xml:space="preserve"> (Admin).</w:t>
+        <w:t xml:space="preserve"> (Admin of Northfield, a sub with every module).</w:t>
       </w:r>
     </w:p>
     <w:p>
@@ -1542,7 +1709,51 @@
           <w:b w:val="0"/>
           <w:i/>
         </w:rPr>
-        <w:t>The modules screen after signing in</w:t>
+        <w:t>The modules screen of a subcontractor with every module</w:t>
+      </w:r>
+    </w:p>
+    <w:p>
+      <w:pPr>
+        <w:pStyle w:val="ListNumber"/>
+        <w:numPr>
+          <w:ilvl w:val="0"/>
+          <w:numId w:val="12"/>
+        </w:numPr>
+      </w:pPr>
+      <w:r>
+        <w:rPr>
+          <w:b w:val="0"/>
+          <w:i w:val="0"/>
+        </w:rPr>
+        <w:t xml:space="preserve">Mention that a general contractor sees fewer modules: it manages the jobs, so it has </w:t>
+      </w:r>
+      <w:r>
+        <w:rPr>
+          <w:b/>
+          <w:i w:val="0"/>
+        </w:rPr>
+        <w:t>Daily</w:t>
+      </w:r>
+      <w:r>
+        <w:rPr>
+          <w:b w:val="0"/>
+          <w:i w:val="0"/>
+        </w:rPr>
+        <w:t xml:space="preserve"> (to follow and approve) and </w:t>
+      </w:r>
+      <w:r>
+        <w:rPr>
+          <w:b/>
+          <w:i w:val="0"/>
+        </w:rPr>
+        <w:t>Settings</w:t>
+      </w:r>
+      <w:r>
+        <w:rPr>
+          <w:b w:val="0"/>
+          <w:i w:val="0"/>
+        </w:rPr>
+        <w:t>, but no time clock or takeoff of its own.</w:t>
       </w:r>
     </w:p>
     <w:p>
@@ -1566,7 +1777,7 @@
           <w:b w:val="0"/>
           <w:i w:val="0"/>
         </w:rPr>
-        <w:t>"Each company turns on the modules it needs. The jobs, people and contacts are entered once and used by every module."</w:t>
+        <w:t>"Each company turns on the modules it needs. The jobs, people and contacts are entered once and used by every module. The subs do the work and record it; the general contractor follows and approves."</w:t>
       </w:r>
     </w:p>
     <w:p>
@@ -1595,7 +1806,7 @@
         <w:pStyle w:val="ListNumber"/>
         <w:numPr>
           <w:ilvl w:val="0"/>
-          <w:numId w:val="12"/>
+          <w:numId w:val="13"/>
         </w:numPr>
       </w:pPr>
       <w:r>
@@ -1617,7 +1828,7 @@
           <w:b w:val="0"/>
           <w:i w:val="0"/>
         </w:rPr>
-        <w:t xml:space="preserve"> (Foreman). Daily opens on </w:t>
+        <w:t xml:space="preserve"> (Foreman at Ridgeline, the concrete and masonry sub). Daily opens on </w:t>
       </w:r>
       <w:r>
         <w:rPr>
@@ -1639,7 +1850,7 @@
         <w:pStyle w:val="ListNumber"/>
         <w:numPr>
           <w:ilvl w:val="0"/>
-          <w:numId w:val="12"/>
+          <w:numId w:val="13"/>
         </w:numPr>
       </w:pPr>
       <w:r>
@@ -1675,7 +1886,7 @@
           <w:b w:val="0"/>
           <w:i w:val="0"/>
         </w:rPr>
-        <w:t>, with the time left until 6 PM) and the request for changes sent by the office.</w:t>
+        <w:t>, with the time left until 6 PM) and the request for changes sent by the general contractor.</w:t>
       </w:r>
     </w:p>
     <w:p>
@@ -1683,7 +1894,7 @@
         <w:pStyle w:val="ListNumber"/>
         <w:numPr>
           <w:ilvl w:val="0"/>
-          <w:numId w:val="12"/>
+          <w:numId w:val="13"/>
         </w:numPr>
       </w:pPr>
       <w:r>
@@ -1741,7 +1952,7 @@
         <w:pStyle w:val="ListNumber"/>
         <w:numPr>
           <w:ilvl w:val="0"/>
-          <w:numId w:val="12"/>
+          <w:numId w:val="13"/>
         </w:numPr>
       </w:pPr>
       <w:r>
@@ -1813,7 +2024,7 @@
         <w:pStyle w:val="ListNumber"/>
         <w:numPr>
           <w:ilvl w:val="0"/>
-          <w:numId w:val="12"/>
+          <w:numId w:val="13"/>
         </w:numPr>
       </w:pPr>
       <w:r>
@@ -1835,7 +2046,7 @@
           <w:b w:val="0"/>
           <w:i w:val="0"/>
         </w:rPr>
-        <w:t>.</w:t>
+        <w:t>. The report goes to the general contractor, who approves it.</w:t>
       </w:r>
     </w:p>
     <w:p>
@@ -1910,7 +2121,7 @@
           <w:b w:val="0"/>
           <w:i w:val="0"/>
         </w:rPr>
-        <w:t>"The foreman fills out the report at the end of the day, on the phone, in three or four minutes — copying yesterday, adjusting the crew, dictating what was done. Photos get a stamp with the date, time and GPS inside the image. If he forgets, the app reminds him at 4 PM, flags it at 6 PM and tells the office the next morning."</w:t>
+        <w:t>"The sub's foreman fills out the report at the end of the day, on the phone, in three or four minutes — copying yesterday, adjusting the crew, dictating what was done. Photos get a stamp with the date, time and GPS inside the image. If he forgets, the app reminds him at 4 PM, flags it at 6 PM and tells the general contractor the next morning."</w:t>
       </w:r>
     </w:p>
     <w:p>
@@ -1953,7 +2164,7 @@
         <w:pStyle w:val="ListNumber"/>
         <w:numPr>
           <w:ilvl w:val="0"/>
-          <w:numId w:val="13"/>
+          <w:numId w:val="14"/>
         </w:numPr>
       </w:pPr>
       <w:r>
@@ -1983,7 +2194,7 @@
         <w:pStyle w:val="ListNumber"/>
         <w:numPr>
           <w:ilvl w:val="0"/>
-          <w:numId w:val="13"/>
+          <w:numId w:val="14"/>
         </w:numPr>
       </w:pPr>
       <w:r>
@@ -1999,7 +2210,7 @@
         <w:pStyle w:val="ListNumber"/>
         <w:numPr>
           <w:ilvl w:val="0"/>
-          <w:numId w:val="13"/>
+          <w:numId w:val="14"/>
         </w:numPr>
       </w:pPr>
       <w:r>
@@ -2043,7 +2254,7 @@
           <w:b w:val="0"/>
           <w:i w:val="0"/>
         </w:rPr>
-        <w:t>Act 4 — The office: review, approve and seal (4 min)</w:t>
+        <w:t>Act 4 — The general contractor: review, approve and seal (5 min)</w:t>
       </w:r>
     </w:p>
     <w:p>
@@ -2051,7 +2262,7 @@
         <w:pStyle w:val="ListNumber"/>
         <w:numPr>
           <w:ilvl w:val="0"/>
-          <w:numId w:val="14"/>
+          <w:numId w:val="15"/>
         </w:numPr>
       </w:pPr>
       <w:r>
@@ -2073,7 +2284,7 @@
           <w:b w:val="0"/>
           <w:i w:val="0"/>
         </w:rPr>
-        <w:t xml:space="preserve">. Daily opens on the </w:t>
+        <w:t xml:space="preserve"> (Example Builders, the GC). Daily opens on the </w:t>
       </w:r>
       <w:r>
         <w:rPr>
@@ -2087,7 +2298,21 @@
           <w:b w:val="0"/>
           <w:i w:val="0"/>
         </w:rPr>
-        <w:t>: today's numbers, the job status (green, yellow, red) and the approval queue.</w:t>
+        <w:t xml:space="preserve">: today's numbers, a status light (green, yellow, red) </w:t>
+      </w:r>
+      <w:r>
+        <w:rPr>
+          <w:b/>
+          <w:i w:val="0"/>
+        </w:rPr>
+        <w:t>for each subcontractor on each job</w:t>
+      </w:r>
+      <w:r>
+        <w:rPr>
+          <w:b w:val="0"/>
+          <w:i w:val="0"/>
+        </w:rPr>
+        <w:t>, and the approval queue with the reports of both subs.</w:t>
       </w:r>
     </w:p>
     <w:p>
@@ -2095,7 +2320,116 @@
         <w:pStyle w:val="ListNumber"/>
         <w:numPr>
           <w:ilvl w:val="0"/>
-          <w:numId w:val="14"/>
+          <w:numId w:val="15"/>
+        </w:numPr>
+      </w:pPr>
+      <w:r>
+        <w:rPr>
+          <w:b w:val="0"/>
+          <w:i w:val="0"/>
+        </w:rPr>
+        <w:t xml:space="preserve">Open </w:t>
+      </w:r>
+      <w:r>
+        <w:rPr>
+          <w:b/>
+          <w:i w:val="0"/>
+        </w:rPr>
+        <w:t>Jobs › Maple Gardens Residences</w:t>
+      </w:r>
+      <w:r>
+        <w:rPr>
+          <w:b w:val="0"/>
+          <w:i w:val="0"/>
+        </w:rPr>
+        <w:t xml:space="preserve">. Show </w:t>
+      </w:r>
+      <w:r>
+        <w:rPr>
+          <w:b/>
+          <w:i w:val="0"/>
+        </w:rPr>
+        <w:t>Subcontractors on this job</w:t>
+      </w:r>
+      <w:r>
+        <w:rPr>
+          <w:b w:val="0"/>
+          <w:i w:val="0"/>
+        </w:rPr>
+        <w:t xml:space="preserve">: Ridgeline and Northfield, who is on site now, since when, and the hours — </w:t>
+      </w:r>
+      <w:r>
+        <w:rPr>
+          <w:b/>
+          <w:i w:val="0"/>
+        </w:rPr>
+        <w:t>no dollar amounts</w:t>
+      </w:r>
+      <w:r>
+        <w:rPr>
+          <w:b w:val="0"/>
+          <w:i w:val="0"/>
+        </w:rPr>
+        <w:t>. Below, the reports of each sub.</w:t>
+      </w:r>
+    </w:p>
+    <w:p>
+      <w:pPr>
+        <w:jc w:val="center"/>
+      </w:pPr>
+      <w:r>
+        <w:drawing>
+          <wp:inline xmlns:a="http://schemas.openxmlformats.org/drawingml/2006/main" xmlns:pic="http://schemas.openxmlformats.org/drawingml/2006/picture">
+            <wp:extent cx="5760000" cy="3702242"/>
+            <wp:docPr id="5" name="Picture 5"/>
+            <wp:cNvGraphicFramePr>
+              <a:graphicFrameLocks noChangeAspect="1"/>
+            </wp:cNvGraphicFramePr>
+            <a:graphic>
+              <a:graphicData uri="http://schemas.openxmlformats.org/drawingml/2006/picture">
+                <pic:pic>
+                  <pic:nvPicPr>
+                    <pic:cNvPr id="0" name="daily-job-subcontractors.png"/>
+                    <pic:cNvPicPr/>
+                  </pic:nvPicPr>
+                  <pic:blipFill>
+                    <a:blip r:embed="rId13"/>
+                    <a:stretch>
+                      <a:fillRect/>
+                    </a:stretch>
+                  </pic:blipFill>
+                  <pic:spPr>
+                    <a:xfrm>
+                      <a:off x="0" y="0"/>
+                      <a:ext cx="5760000" cy="3702242"/>
+                    </a:xfrm>
+                    <a:prstGeom prst="rect"/>
+                  </pic:spPr>
+                </pic:pic>
+              </a:graphicData>
+            </a:graphic>
+          </wp:inline>
+        </w:drawing>
+      </w:r>
+    </w:p>
+    <w:p>
+      <w:pPr>
+        <w:jc w:val="center"/>
+      </w:pPr>
+      <w:r>
+        <w:rPr>
+          <w:b w:val="0"/>
+          <w:i/>
+        </w:rPr>
+        <w:t>The general contractor's view: each subcontractor with the people on site and the hours</w:t>
+      </w:r>
+    </w:p>
+    <w:p>
+      <w:pPr>
+        <w:pStyle w:val="ListNumber"/>
+        <w:numPr>
+          <w:ilvl w:val="0"/>
+          <w:numId w:val="15"/>
         </w:numPr>
       </w:pPr>
       <w:r>
@@ -2139,7 +2473,7 @@
         <w:pStyle w:val="ListNumber"/>
         <w:numPr>
           <w:ilvl w:val="0"/>
-          <w:numId w:val="14"/>
+          <w:numId w:val="15"/>
         </w:numPr>
       </w:pPr>
       <w:r>
@@ -2161,7 +2495,7 @@
           <w:b w:val="0"/>
           <w:i w:val="0"/>
         </w:rPr>
-        <w:t>: the reason goes back to the foreman's phone. (Cancel it for the demo.)</w:t>
+        <w:t>: the reason goes back to the sub's foreman. (Cancel it for the demo.)</w:t>
       </w:r>
     </w:p>
     <w:p>
@@ -2169,7 +2503,7 @@
         <w:pStyle w:val="ListNumber"/>
         <w:numPr>
           <w:ilvl w:val="0"/>
-          <w:numId w:val="14"/>
+          <w:numId w:val="15"/>
         </w:numPr>
       </w:pPr>
       <w:r>
@@ -2216,7 +2550,7 @@
         <w:drawing>
           <wp:inline xmlns:a="http://schemas.openxmlformats.org/drawingml/2006/main" xmlns:pic="http://schemas.openxmlformats.org/drawingml/2006/picture">
             <wp:extent cx="5760000" cy="3625293"/>
-            <wp:docPr id="5" name="Picture 5"/>
+            <wp:docPr id="6" name="Picture 6"/>
             <wp:cNvGraphicFramePr>
               <a:graphicFrameLocks noChangeAspect="1"/>
             </wp:cNvGraphicFramePr>
@@ -2228,7 +2562,7 @@
                     <pic:cNvPicPr/>
                   </pic:nvPicPr>
                   <pic:blipFill>
-                    <a:blip r:embed="rId13"/>
+                    <a:blip r:embed="rId14"/>
                     <a:stretch>
                       <a:fillRect/>
                     </a:stretch>
@@ -2280,7 +2614,7 @@
           <w:b w:val="0"/>
           <w:i w:val="0"/>
         </w:rPr>
-        <w:t>"The office sees at a glance which jobs reported today. Approval seals the report with a digital fingerprint: if anyone changes a single word or photo later, the client's link shows that the document was altered."</w:t>
+        <w:t>"You see at a glance which sub reported today on each job, who is on site and how many hours — without seeing what they pay their people. You approve the subs' reports; approval seals the report with a digital fingerprint: if anyone changes a single word or photo later, the owner's link shows that the document was altered."</w:t>
       </w:r>
     </w:p>
     <w:p>
@@ -2300,7 +2634,7 @@
         <w:pStyle w:val="ListNumber"/>
         <w:numPr>
           <w:ilvl w:val="0"/>
-          <w:numId w:val="15"/>
+          <w:numId w:val="16"/>
         </w:numPr>
       </w:pPr>
       <w:r>
@@ -2344,7 +2678,7 @@
         <w:pStyle w:val="ListNumber"/>
         <w:numPr>
           <w:ilvl w:val="0"/>
-          <w:numId w:val="15"/>
+          <w:numId w:val="16"/>
         </w:numPr>
       </w:pPr>
       <w:r>
@@ -2374,7 +2708,7 @@
         <w:pStyle w:val="ListNumber"/>
         <w:numPr>
           <w:ilvl w:val="0"/>
-          <w:numId w:val="15"/>
+          <w:numId w:val="16"/>
         </w:numPr>
       </w:pPr>
       <w:r>
@@ -2407,7 +2741,7 @@
         <w:drawing>
           <wp:inline xmlns:a="http://schemas.openxmlformats.org/drawingml/2006/main" xmlns:pic="http://schemas.openxmlformats.org/drawingml/2006/picture">
             <wp:extent cx="5760000" cy="3625293"/>
-            <wp:docPr id="6" name="Picture 6"/>
+            <wp:docPr id="7" name="Picture 7"/>
             <wp:cNvGraphicFramePr>
               <a:graphicFrameLocks noChangeAspect="1"/>
             </wp:cNvGraphicFramePr>
@@ -2419,7 +2753,7 @@
                     <pic:cNvPicPr/>
                   </pic:nvPicPr>
                   <pic:blipFill>
-                    <a:blip r:embed="rId14"/>
+                    <a:blip r:embed="rId15"/>
                     <a:stretch>
                       <a:fillRect/>
                     </a:stretch>
@@ -2487,11 +2821,20 @@
       </w:r>
     </w:p>
     <w:p>
+      <w:r>
+        <w:rPr>
+          <w:b w:val="0"/>
+          <w:i w:val="0"/>
+        </w:rPr>
+        <w:t>The time clock belongs to each subcontractor: it clocks in its own people and sees its own labor cost.</w:t>
+      </w:r>
+    </w:p>
+    <w:p>
       <w:pPr>
         <w:pStyle w:val="ListNumber"/>
         <w:numPr>
           <w:ilvl w:val="0"/>
-          <w:numId w:val="16"/>
+          <w:numId w:val="17"/>
         </w:numPr>
       </w:pPr>
       <w:r>
@@ -2513,7 +2856,7 @@
           <w:b w:val="0"/>
           <w:i w:val="0"/>
         </w:rPr>
-        <w:t xml:space="preserve"> (Worker). KORbuild opens straight on </w:t>
+        <w:t xml:space="preserve"> (Worker at Ridgeline). KORbuild opens straight on </w:t>
       </w:r>
       <w:r>
         <w:rPr>
@@ -2538,7 +2881,7 @@
         <w:drawing>
           <wp:inline xmlns:a="http://schemas.openxmlformats.org/drawingml/2006/main" xmlns:pic="http://schemas.openxmlformats.org/drawingml/2006/picture">
             <wp:extent cx="2520000" cy="5453538"/>
-            <wp:docPr id="7" name="Picture 7"/>
+            <wp:docPr id="8" name="Picture 8"/>
             <wp:cNvGraphicFramePr>
               <a:graphicFrameLocks noChangeAspect="1"/>
             </wp:cNvGraphicFramePr>
@@ -2550,7 +2893,7 @@
                     <pic:cNvPicPr/>
                   </pic:nvPicPr>
                   <pic:blipFill>
-                    <a:blip r:embed="rId15"/>
+                    <a:blip r:embed="rId16"/>
                     <a:stretch>
                       <a:fillRect/>
                     </a:stretch>
@@ -2586,7 +2929,7 @@
         <w:pStyle w:val="ListNumber"/>
         <w:numPr>
           <w:ilvl w:val="0"/>
-          <w:numId w:val="16"/>
+          <w:numId w:val="17"/>
         </w:numPr>
       </w:pPr>
       <w:r>
@@ -2689,7 +3032,7 @@
         <w:drawing>
           <wp:inline xmlns:a="http://schemas.openxmlformats.org/drawingml/2006/main" xmlns:pic="http://schemas.openxmlformats.org/drawingml/2006/picture">
             <wp:extent cx="2520000" cy="3644746"/>
-            <wp:docPr id="8" name="Picture 8"/>
+            <wp:docPr id="9" name="Picture 9"/>
             <wp:cNvGraphicFramePr>
               <a:graphicFrameLocks noChangeAspect="1"/>
             </wp:cNvGraphicFramePr>
@@ -2701,7 +3044,7 @@
                     <pic:cNvPicPr/>
                   </pic:nvPicPr>
                   <pic:blipFill>
-                    <a:blip r:embed="rId16"/>
+                    <a:blip r:embed="rId17"/>
                     <a:stretch>
                       <a:fillRect/>
                     </a:stretch>
@@ -2737,7 +3080,7 @@
         <w:pStyle w:val="ListNumber"/>
         <w:numPr>
           <w:ilvl w:val="0"/>
-          <w:numId w:val="16"/>
+          <w:numId w:val="17"/>
         </w:numPr>
       </w:pPr>
       <w:r>
@@ -2767,7 +3110,7 @@
         <w:pStyle w:val="ListNumber"/>
         <w:numPr>
           <w:ilvl w:val="0"/>
-          <w:numId w:val="16"/>
+          <w:numId w:val="17"/>
         </w:numPr>
       </w:pPr>
       <w:r>
@@ -2782,14 +3125,14 @@
           <w:b/>
           <w:i w:val="0"/>
         </w:rPr>
-        <w:t>Ana Ribeiro</w:t>
+        <w:t>Sandra Lopes</w:t>
       </w:r>
       <w:r>
         <w:rPr>
           <w:b w:val="0"/>
           <w:i w:val="0"/>
         </w:rPr>
-        <w:t xml:space="preserve"> (Admin), open </w:t>
+        <w:t xml:space="preserve"> (Admin at Ridgeline), open </w:t>
       </w:r>
       <w:r>
         <w:rPr>
@@ -2839,7 +3182,7 @@
         <w:pStyle w:val="ListNumber"/>
         <w:numPr>
           <w:ilvl w:val="0"/>
-          <w:numId w:val="16"/>
+          <w:numId w:val="17"/>
         </w:numPr>
       </w:pPr>
       <w:r>
@@ -2911,7 +3254,7 @@
         <w:pStyle w:val="ListNumber"/>
         <w:numPr>
           <w:ilvl w:val="0"/>
-          <w:numId w:val="16"/>
+          <w:numId w:val="17"/>
         </w:numPr>
       </w:pPr>
       <w:r>
@@ -2972,7 +3315,7 @@
         <w:drawing>
           <wp:inline xmlns:a="http://schemas.openxmlformats.org/drawingml/2006/main" xmlns:pic="http://schemas.openxmlformats.org/drawingml/2006/picture">
             <wp:extent cx="5760000" cy="3625293"/>
-            <wp:docPr id="9" name="Picture 9"/>
+            <wp:docPr id="10" name="Picture 10"/>
             <wp:cNvGraphicFramePr>
               <a:graphicFrameLocks noChangeAspect="1"/>
             </wp:cNvGraphicFramePr>
@@ -2984,7 +3327,7 @@
                     <pic:cNvPicPr/>
                   </pic:nvPicPr>
                   <pic:blipFill>
-                    <a:blip r:embed="rId17"/>
+                    <a:blip r:embed="rId18"/>
                     <a:stretch>
                       <a:fillRect/>
                     </a:stretch>
@@ -3036,7 +3379,7 @@
           <w:b w:val="0"/>
           <w:i w:val="0"/>
         </w:rPr>
-        <w:t>"The foreman clocks in the whole crew in seconds, with GPS and the job's geofence — no paper card, no buddy punching. The office approves the week and exports it to payroll. And the owner sees, a third of the way into the job, that labor is going to run over — while there is still time to act."</w:t>
+        <w:t>"The foreman clocks in the whole crew in seconds, with GPS and the job's geofence — no paper card, no buddy punching. The sub's office approves the week and exports it to payroll. And the sub's owner sees, a third of the way into the job, that labor is going to run over — while there is still time to act. The general contractor sees the people and the hours on its job, never the wages."</w:t>
       </w:r>
     </w:p>
     <w:p>
@@ -3214,6 +3557,20 @@
           <w:b/>
           <w:i w:val="0"/>
         </w:rPr>
+        <w:t>Sandra</w:t>
+      </w:r>
+      <w:r>
+        <w:rPr>
+          <w:b w:val="0"/>
+          <w:i w:val="0"/>
+        </w:rPr>
+        <w:t xml:space="preserve">: employees (with the employer company), hourly rate history, labor burden, work rules, jobs, users and access roles, audit log. As </w:t>
+      </w:r>
+      <w:r>
+        <w:rPr>
+          <w:b/>
+          <w:i w:val="0"/>
+        </w:rPr>
         <w:t>Ana</w:t>
       </w:r>
       <w:r>
@@ -3221,7 +3578,54 @@
           <w:b w:val="0"/>
           <w:i w:val="0"/>
         </w:rPr>
-        <w:t>: employees with hourly rate history, labor burden, work rules, jobs, users and access roles, audit log.</w:t>
+        <w:t>, the general contractor's Settings is lighter: jobs (with their subcontractors), contacts, users and roles.</w:t>
+      </w:r>
+    </w:p>
+    <w:p>
+      <w:pPr>
+        <w:pStyle w:val="ListBullet"/>
+      </w:pPr>
+      <w:r>
+        <w:rPr>
+          <w:b/>
+          <w:i w:val="0"/>
+        </w:rPr>
+        <w:t>A sub on its own</w:t>
+      </w:r>
+      <w:r>
+        <w:rPr>
+          <w:b w:val="0"/>
+          <w:i w:val="0"/>
+        </w:rPr>
+        <w:t xml:space="preserve"> — as </w:t>
+      </w:r>
+      <w:r>
+        <w:rPr>
+          <w:b/>
+          <w:i w:val="0"/>
+        </w:rPr>
+        <w:t>Tom</w:t>
+      </w:r>
+      <w:r>
+        <w:rPr>
+          <w:b w:val="0"/>
+          <w:i w:val="0"/>
+        </w:rPr>
+        <w:t xml:space="preserve">, Daily › Jobs › </w:t>
+      </w:r>
+      <w:r>
+        <w:rPr>
+          <w:b/>
+          <w:i w:val="0"/>
+        </w:rPr>
+        <w:t>Thompson residence</w:t>
+      </w:r>
+      <w:r>
+        <w:rPr>
+          <w:b w:val="0"/>
+          <w:i w:val="0"/>
+        </w:rPr>
+        <w:t>: a homeowner job with no general contractor. Here Northfield approves its own reports.</w:t>
       </w:r>
     </w:p>
     <w:p>
@@ -3434,6 +3838,108 @@
                 <w:sz w:val="18"/>
               </w:rPr>
               <w:t>Nothing: they receive a link and can download the PDF. No account, no cost.</w:t>
+            </w:r>
+          </w:p>
+        </w:tc>
+      </w:tr>
+      <w:tr>
+        <w:tc>
+          <w:tcPr>
+            <w:tcW w:type="dxa" w:w="4873"/>
+          </w:tcPr>
+          <w:p>
+            <w:r/>
+            <w:r>
+              <w:rPr>
+                <w:b w:val="0"/>
+                <w:i w:val="0"/>
+                <w:sz w:val="18"/>
+              </w:rPr>
+              <w:t>Can the general contractor see what a sub pays its people?</w:t>
+            </w:r>
+          </w:p>
+        </w:tc>
+        <w:tc>
+          <w:tcPr>
+            <w:tcW w:type="dxa" w:w="4873"/>
+          </w:tcPr>
+          <w:p>
+            <w:r/>
+            <w:r>
+              <w:rPr>
+                <w:b w:val="0"/>
+                <w:i w:val="0"/>
+                <w:sz w:val="18"/>
+              </w:rPr>
+              <w:t>No. It sees names, time on site and hours. Wages, labor burden and cost stay with the sub.</w:t>
+            </w:r>
+          </w:p>
+        </w:tc>
+      </w:tr>
+      <w:tr>
+        <w:tc>
+          <w:tcPr>
+            <w:tcW w:type="dxa" w:w="4873"/>
+          </w:tcPr>
+          <w:p>
+            <w:r/>
+            <w:r>
+              <w:rPr>
+                <w:b w:val="0"/>
+                <w:i w:val="0"/>
+                <w:sz w:val="18"/>
+              </w:rPr>
+              <w:t>Do we need a general contractor to use KORbuild?</w:t>
+            </w:r>
+          </w:p>
+        </w:tc>
+        <w:tc>
+          <w:tcPr>
+            <w:tcW w:type="dxa" w:w="4873"/>
+          </w:tcPr>
+          <w:p>
+            <w:r/>
+            <w:r>
+              <w:rPr>
+                <w:b w:val="0"/>
+                <w:i w:val="0"/>
+                <w:sz w:val="18"/>
+              </w:rPr>
+              <w:t>No. A subcontractor can subscribe on its own and run its jobs directly with the owner.</w:t>
+            </w:r>
+          </w:p>
+        </w:tc>
+      </w:tr>
+      <w:tr>
+        <w:tc>
+          <w:tcPr>
+            <w:tcW w:type="dxa" w:w="4873"/>
+          </w:tcPr>
+          <w:p>
+            <w:r/>
+            <w:r>
+              <w:rPr>
+                <w:b w:val="0"/>
+                <w:i w:val="0"/>
+                <w:sz w:val="18"/>
+              </w:rPr>
+              <w:t>Who approves the sub's daily report?</w:t>
+            </w:r>
+          </w:p>
+        </w:tc>
+        <w:tc>
+          <w:tcPr>
+            <w:tcW w:type="dxa" w:w="4873"/>
+          </w:tcPr>
+          <w:p>
+            <w:r/>
+            <w:r>
+              <w:rPr>
+                <w:b w:val="0"/>
+                <w:i w:val="0"/>
+                <w:sz w:val="18"/>
+              </w:rPr>
+              <w:t>The general contractor of the job. On a job straight with the owner, the sub approves its own.</w:t>
             </w:r>
           </w:p>
         </w:tc>
@@ -3846,6 +4352,12 @@
     </w:lvlOverride>
   </w:num>
   <w:num w:numId="16">
+    <w:abstractNumId w:val="7"/>
+    <w:lvlOverride w:ilvl="0">
+      <w:startOverride w:val="1"/>
+    </w:lvlOverride>
+  </w:num>
+  <w:num w:numId="17">
     <w:abstractNumId w:val="7"/>
     <w:lvlOverride w:ilvl="0">
       <w:startOverride w:val="1"/>

</xml_diff>

<commit_message>
Portal: módulo Measure (inglês) e o ato do Measure no guia do apresentador
- Visão geral, manual do usuário (do PDF à proposta: escala, assemblies,
  medição, recortes, vãos, typicals, materiais com o cálculo, cotação,
  preços, proposta, catálogo), regras MSR-001 a 059, perfis e o que é
  simulado
- 29 capturas novas geradas pelo protótipo (planta, fachadas, materiais,
  cotação, proposta, typicals)
- Guia do apresentador: ato 7 do Measure (7 min)
- Proposta em inglês: "calculated" e "entered manually" (estavam em
  português)

Co-Authored-By: Claude Opus 5.5 <noreply@anthropic.com>
Claude-Session: https://claude.ai/code/session_01Ep8bJsuQq2bqGePCMzzux2
</commit_message>
<xml_diff>
--- a/portal/files/KORbuild - Presenters guide.docx
+++ b/portal/files/KORbuild - Presenters guide.docx
@@ -34,21 +34,21 @@
           <w:b w:val="0"/>
           <w:i w:val="0"/>
         </w:rPr>
-        <w:t xml:space="preserve">This guide is for the person who will present KORbuild to a customer. You do not need to know the system beforehand: follow the order below, sign in with the users indicated, and use the "what to say" boxes as your script. A presentation of Daily and Crew takes about </w:t>
+        <w:t xml:space="preserve">This guide is for the person who will present KORbuild to a customer. You do not need to know the system beforehand: follow the order below, sign in with the users indicated, and use the "what to say" boxes as your script. A presentation of Daily, Crew and Measure takes about </w:t>
       </w:r>
       <w:r>
         <w:rPr>
           <w:b/>
           <w:i w:val="0"/>
         </w:rPr>
-        <w:t>25 minutes</w:t>
+        <w:t>35 minutes</w:t>
       </w:r>
       <w:r>
         <w:rPr>
           <w:b w:val="0"/>
           <w:i w:val="0"/>
         </w:rPr>
-        <w:t>; with questions, plan for 40.</w:t>
+        <w:t>; with questions, plan for 50.</w:t>
       </w:r>
     </w:p>
     <w:p>
@@ -3414,7 +3414,7 @@
           <w:b w:val="0"/>
           <w:i w:val="0"/>
         </w:rPr>
-        <w:t>Act 7 — The other modules (optional)</w:t>
+        <w:t>Act 7 — Measure: from the plan to the proposal (7 min)</w:t>
       </w:r>
     </w:p>
     <w:p>
@@ -3423,7 +3423,593 @@
           <w:b w:val="0"/>
           <w:i w:val="0"/>
         </w:rPr>
-        <w:t>Detailed scripts for Measure and Settings will be added to this guide. Meanwhile, the highlights:</w:t>
+        <w:t>Use a computer. Measure belongs to the subcontractor that estimates the work.</w:t>
+      </w:r>
+    </w:p>
+    <w:p>
+      <w:pPr>
+        <w:pStyle w:val="ListNumber"/>
+        <w:numPr>
+          <w:ilvl w:val="0"/>
+          <w:numId w:val="18"/>
+        </w:numPr>
+      </w:pPr>
+      <w:r>
+        <w:rPr>
+          <w:b w:val="0"/>
+          <w:i w:val="0"/>
+        </w:rPr>
+        <w:t xml:space="preserve">Sign in as </w:t>
+      </w:r>
+      <w:r>
+        <w:rPr>
+          <w:b/>
+          <w:i w:val="0"/>
+        </w:rPr>
+        <w:t>Tom Reilly</w:t>
+      </w:r>
+      <w:r>
+        <w:rPr>
+          <w:b w:val="0"/>
+          <w:i w:val="0"/>
+        </w:rPr>
+        <w:t xml:space="preserve"> (Northfield), open </w:t>
+      </w:r>
+      <w:r>
+        <w:rPr>
+          <w:b/>
+          <w:i w:val="0"/>
+        </w:rPr>
+        <w:t>Measure</w:t>
+      </w:r>
+      <w:r>
+        <w:rPr>
+          <w:b w:val="0"/>
+          <w:i w:val="0"/>
+        </w:rPr>
+        <w:t xml:space="preserve">: the </w:t>
+      </w:r>
+      <w:r>
+        <w:rPr>
+          <w:b/>
+          <w:i w:val="0"/>
+        </w:rPr>
+        <w:t>Projects</w:t>
+      </w:r>
+      <w:r>
+        <w:rPr>
+          <w:b w:val="0"/>
+          <w:i w:val="0"/>
+        </w:rPr>
+        <w:t xml:space="preserve"> list with clients, bid due dates and status.</w:t>
+      </w:r>
+    </w:p>
+    <w:p>
+      <w:pPr>
+        <w:pStyle w:val="ListNumber"/>
+        <w:numPr>
+          <w:ilvl w:val="0"/>
+          <w:numId w:val="18"/>
+        </w:numPr>
+      </w:pPr>
+      <w:r>
+        <w:rPr>
+          <w:b w:val="0"/>
+          <w:i w:val="0"/>
+        </w:rPr>
+        <w:t xml:space="preserve">Open </w:t>
+      </w:r>
+      <w:r>
+        <w:rPr>
+          <w:b/>
+          <w:i w:val="0"/>
+        </w:rPr>
+        <w:t>Model home</w:t>
+      </w:r>
+      <w:r>
+        <w:rPr>
+          <w:b w:val="0"/>
+          <w:i w:val="0"/>
+        </w:rPr>
+        <w:t xml:space="preserve"> and the sheet </w:t>
+      </w:r>
+      <w:r>
+        <w:rPr>
+          <w:b/>
+          <w:i w:val="0"/>
+        </w:rPr>
+        <w:t>A-101 · First Floor Plan</w:t>
+      </w:r>
+      <w:r>
+        <w:rPr>
+          <w:b w:val="0"/>
+          <w:i w:val="0"/>
+        </w:rPr>
+        <w:t>. The plan fills the screen.</w:t>
+      </w:r>
+    </w:p>
+    <w:p>
+      <w:pPr>
+        <w:pStyle w:val="ListNumber"/>
+        <w:numPr>
+          <w:ilvl w:val="0"/>
+          <w:numId w:val="18"/>
+        </w:numPr>
+      </w:pPr>
+      <w:r>
+        <w:rPr>
+          <w:b w:val="0"/>
+          <w:i w:val="0"/>
+        </w:rPr>
+        <w:t xml:space="preserve">Click </w:t>
+      </w:r>
+      <w:r>
+        <w:rPr>
+          <w:b/>
+          <w:i w:val="0"/>
+        </w:rPr>
+        <w:t>Set scale</w:t>
+      </w:r>
+      <w:r>
+        <w:rPr>
+          <w:b w:val="0"/>
+          <w:i w:val="0"/>
+        </w:rPr>
+        <w:t xml:space="preserve">, choose </w:t>
+      </w:r>
+      <w:r>
+        <w:rPr>
+          <w:rFonts w:ascii="Consolas" w:hAnsi="Consolas"/>
+          <w:b w:val="0"/>
+          <w:i w:val="0"/>
+        </w:rPr>
+        <w:t>1/4" = 1'-0"</w:t>
+      </w:r>
+      <w:r>
+        <w:rPr>
+          <w:b w:val="0"/>
+          <w:i w:val="0"/>
+        </w:rPr>
+        <w:t xml:space="preserve">, then check it on the 40'-0" dimension at the top: click both ends, type </w:t>
+      </w:r>
+      <w:r>
+        <w:rPr>
+          <w:rFonts w:ascii="Consolas" w:hAnsi="Consolas"/>
+          <w:b w:val="0"/>
+          <w:i w:val="0"/>
+        </w:rPr>
+        <w:t>40'</w:t>
+      </w:r>
+      <w:r>
+        <w:rPr>
+          <w:b w:val="0"/>
+          <w:i w:val="0"/>
+        </w:rPr>
+        <w:t xml:space="preserve">. The toolbar says </w:t>
+      </w:r>
+      <w:r>
+        <w:rPr>
+          <w:b/>
+          <w:i w:val="0"/>
+        </w:rPr>
+        <w:t>checked</w:t>
+      </w:r>
+      <w:r>
+        <w:rPr>
+          <w:b w:val="0"/>
+          <w:i w:val="0"/>
+        </w:rPr>
+        <w:t>.</w:t>
+      </w:r>
+    </w:p>
+    <w:p>
+      <w:pPr>
+        <w:pStyle w:val="ListNumber"/>
+        <w:numPr>
+          <w:ilvl w:val="0"/>
+          <w:numId w:val="18"/>
+        </w:numPr>
+      </w:pPr>
+      <w:r>
+        <w:rPr>
+          <w:b/>
+          <w:i w:val="0"/>
+        </w:rPr>
+        <w:t>Add assembly</w:t>
+      </w:r>
+      <w:r>
+        <w:rPr>
+          <w:b w:val="0"/>
+          <w:i w:val="0"/>
+        </w:rPr>
+        <w:t xml:space="preserve"> › </w:t>
+      </w:r>
+      <w:r>
+        <w:rPr>
+          <w:b/>
+          <w:i w:val="0"/>
+        </w:rPr>
+        <w:t>Exterior wall 2x6 @ 16"</w:t>
+      </w:r>
+      <w:r>
+        <w:rPr>
+          <w:b w:val="0"/>
+          <w:i w:val="0"/>
+        </w:rPr>
+        <w:t xml:space="preserve"> › name </w:t>
+      </w:r>
+      <w:r>
+        <w:rPr>
+          <w:b w:val="0"/>
+          <w:i/>
+        </w:rPr>
+        <w:t>Exterior walls</w:t>
+      </w:r>
+      <w:r>
+        <w:rPr>
+          <w:b w:val="0"/>
+          <w:i w:val="0"/>
+        </w:rPr>
+        <w:t xml:space="preserve">, height </w:t>
+      </w:r>
+      <w:r>
+        <w:rPr>
+          <w:rFonts w:ascii="Consolas" w:hAnsi="Consolas"/>
+          <w:b w:val="0"/>
+          <w:i w:val="0"/>
+        </w:rPr>
+        <w:t>9'-0"</w:t>
+      </w:r>
+      <w:r>
+        <w:rPr>
+          <w:b w:val="0"/>
+          <w:i w:val="0"/>
+        </w:rPr>
+        <w:t xml:space="preserve"> › </w:t>
+      </w:r>
+      <w:r>
+        <w:rPr>
+          <w:b/>
+          <w:i w:val="0"/>
+        </w:rPr>
+        <w:t>Add to drawing</w:t>
+      </w:r>
+      <w:r>
+        <w:rPr>
+          <w:b w:val="0"/>
+          <w:i w:val="0"/>
+        </w:rPr>
+        <w:t xml:space="preserve">. Click the four corners of the house and press </w:t>
+      </w:r>
+      <w:r>
+        <w:rPr>
+          <w:b/>
+          <w:i w:val="0"/>
+        </w:rPr>
+        <w:t>Enter</w:t>
+      </w:r>
+      <w:r>
+        <w:rPr>
+          <w:b w:val="0"/>
+          <w:i w:val="0"/>
+        </w:rPr>
+        <w:t>: about 136 lin ft and 1,224 sq ft of wall surface.</w:t>
+      </w:r>
+    </w:p>
+    <w:p>
+      <w:pPr>
+        <w:jc w:val="center"/>
+      </w:pPr>
+      <w:r>
+        <w:drawing>
+          <wp:inline xmlns:a="http://schemas.openxmlformats.org/drawingml/2006/main" xmlns:pic="http://schemas.openxmlformats.org/drawingml/2006/picture">
+            <wp:extent cx="5760000" cy="4601600"/>
+            <wp:docPr id="11" name="Picture 11"/>
+            <wp:cNvGraphicFramePr>
+              <a:graphicFrameLocks noChangeAspect="1"/>
+            </wp:cNvGraphicFramePr>
+            <a:graphic>
+              <a:graphicData uri="http://schemas.openxmlformats.org/drawingml/2006/picture">
+                <pic:pic>
+                  <pic:nvPicPr>
+                    <pic:cNvPr id="0" name="measure-viewer-plan.png"/>
+                    <pic:cNvPicPr/>
+                  </pic:nvPicPr>
+                  <pic:blipFill>
+                    <a:blip r:embed="rId19"/>
+                    <a:stretch>
+                      <a:fillRect/>
+                    </a:stretch>
+                  </pic:blipFill>
+                  <pic:spPr>
+                    <a:xfrm>
+                      <a:off x="0" y="0"/>
+                      <a:ext cx="5760000" cy="4601600"/>
+                    </a:xfrm>
+                    <a:prstGeom prst="rect"/>
+                  </pic:spPr>
+                </pic:pic>
+              </a:graphicData>
+            </a:graphic>
+          </wp:inline>
+        </w:drawing>
+      </w:r>
+    </w:p>
+    <w:p>
+      <w:pPr>
+        <w:jc w:val="center"/>
+      </w:pPr>
+      <w:r>
+        <w:rPr>
+          <w:b w:val="0"/>
+          <w:i/>
+        </w:rPr>
+        <w:t>Measuring on the first floor plan</w:t>
+      </w:r>
+    </w:p>
+    <w:p>
+      <w:pPr>
+        <w:pStyle w:val="ListNumber"/>
+        <w:numPr>
+          <w:ilvl w:val="0"/>
+          <w:numId w:val="18"/>
+        </w:numPr>
+      </w:pPr>
+      <w:r>
+        <w:rPr>
+          <w:b w:val="0"/>
+          <w:i w:val="0"/>
+        </w:rPr>
+        <w:t xml:space="preserve">Go back to the project and open </w:t>
+      </w:r>
+      <w:r>
+        <w:rPr>
+          <w:b/>
+          <w:i w:val="0"/>
+        </w:rPr>
+        <w:t>Materials and labor</w:t>
+      </w:r>
+      <w:r>
+        <w:rPr>
+          <w:b w:val="0"/>
+          <w:i w:val="0"/>
+        </w:rPr>
+        <w:t xml:space="preserve">: studs, plates, OSB, house wrap, insulation, drywall and the carpenter hours. Click </w:t>
+      </w:r>
+      <w:r>
+        <w:rPr>
+          <w:b/>
+          <w:i w:val="0"/>
+        </w:rPr>
+        <w:t>OSB</w:t>
+      </w:r>
+      <w:r>
+        <w:rPr>
+          <w:b w:val="0"/>
+          <w:i w:val="0"/>
+        </w:rPr>
+        <w:t xml:space="preserve"> to show the math: wall surface ÷ 32 + 10% waste, rounded up to whole sheets.</w:t>
+      </w:r>
+    </w:p>
+    <w:p>
+      <w:pPr>
+        <w:jc w:val="center"/>
+      </w:pPr>
+      <w:r>
+        <w:drawing>
+          <wp:inline xmlns:a="http://schemas.openxmlformats.org/drawingml/2006/main" xmlns:pic="http://schemas.openxmlformats.org/drawingml/2006/picture">
+            <wp:extent cx="5760000" cy="9552676"/>
+            <wp:docPr id="12" name="Picture 12"/>
+            <wp:cNvGraphicFramePr>
+              <a:graphicFrameLocks noChangeAspect="1"/>
+            </wp:cNvGraphicFramePr>
+            <a:graphic>
+              <a:graphicData uri="http://schemas.openxmlformats.org/drawingml/2006/picture">
+                <pic:pic>
+                  <pic:nvPicPr>
+                    <pic:cNvPr id="0" name="measure-materials.png"/>
+                    <pic:cNvPicPr/>
+                  </pic:nvPicPr>
+                  <pic:blipFill>
+                    <a:blip r:embed="rId20"/>
+                    <a:stretch>
+                      <a:fillRect/>
+                    </a:stretch>
+                  </pic:blipFill>
+                  <pic:spPr>
+                    <a:xfrm>
+                      <a:off x="0" y="0"/>
+                      <a:ext cx="5760000" cy="9552676"/>
+                    </a:xfrm>
+                    <a:prstGeom prst="rect"/>
+                  </pic:spPr>
+                </pic:pic>
+              </a:graphicData>
+            </a:graphic>
+          </wp:inline>
+        </w:drawing>
+      </w:r>
+    </w:p>
+    <w:p>
+      <w:pPr>
+        <w:jc w:val="center"/>
+      </w:pPr>
+      <w:r>
+        <w:rPr>
+          <w:b w:val="0"/>
+          <w:i/>
+        </w:rPr>
+        <w:t>Materials and labor, with the math of one item</w:t>
+      </w:r>
+    </w:p>
+    <w:p>
+      <w:pPr>
+        <w:pStyle w:val="ListNumber"/>
+        <w:numPr>
+          <w:ilvl w:val="0"/>
+          <w:numId w:val="18"/>
+        </w:numPr>
+      </w:pPr>
+      <w:r>
+        <w:rPr>
+          <w:b w:val="0"/>
+          <w:i w:val="0"/>
+        </w:rPr>
+        <w:t xml:space="preserve">Open </w:t>
+      </w:r>
+      <w:r>
+        <w:rPr>
+          <w:b/>
+          <w:i w:val="0"/>
+        </w:rPr>
+        <w:t>Material list for quotes</w:t>
+      </w:r>
+      <w:r>
+        <w:rPr>
+          <w:b w:val="0"/>
+          <w:i w:val="0"/>
+        </w:rPr>
+        <w:t xml:space="preserve">: each supplier gets only its items, in purchase units, without prices. Show </w:t>
+      </w:r>
+      <w:r>
+        <w:rPr>
+          <w:b/>
+          <w:i w:val="0"/>
+        </w:rPr>
+        <w:t>Send by email</w:t>
+      </w:r>
+      <w:r>
+        <w:rPr>
+          <w:b w:val="0"/>
+          <w:i w:val="0"/>
+        </w:rPr>
+        <w:t xml:space="preserve"> and </w:t>
+      </w:r>
+      <w:r>
+        <w:rPr>
+          <w:b/>
+          <w:i w:val="0"/>
+        </w:rPr>
+        <w:t>PDF</w:t>
+      </w:r>
+      <w:r>
+        <w:rPr>
+          <w:b w:val="0"/>
+          <w:i w:val="0"/>
+        </w:rPr>
+        <w:t>.</w:t>
+      </w:r>
+    </w:p>
+    <w:p>
+      <w:pPr>
+        <w:pStyle w:val="ListNumber"/>
+        <w:numPr>
+          <w:ilvl w:val="0"/>
+          <w:numId w:val="18"/>
+        </w:numPr>
+      </w:pPr>
+      <w:r>
+        <w:rPr>
+          <w:b w:val="0"/>
+          <w:i w:val="0"/>
+        </w:rPr>
+        <w:t xml:space="preserve">Open </w:t>
+      </w:r>
+      <w:r>
+        <w:rPr>
+          <w:b/>
+          <w:i w:val="0"/>
+        </w:rPr>
+        <w:t>Proposal</w:t>
+      </w:r>
+      <w:r>
+        <w:rPr>
+          <w:b w:val="0"/>
+          <w:i w:val="0"/>
+        </w:rPr>
+        <w:t xml:space="preserve">: one line per cost code, priced from the catalog and the markups; type a different amount on a line to show a closed price. </w:t>
+      </w:r>
+      <w:r>
+        <w:rPr>
+          <w:b/>
+          <w:i w:val="0"/>
+        </w:rPr>
+        <w:t>View document</w:t>
+      </w:r>
+      <w:r>
+        <w:rPr>
+          <w:b w:val="0"/>
+          <w:i w:val="0"/>
+        </w:rPr>
+        <w:t xml:space="preserve"> shows the PDF the client receives.</w:t>
+      </w:r>
+    </w:p>
+    <w:p>
+      <w:pPr>
+        <w:shd w:val="clear" w:color="auto" w:fill="EEF1F5"/>
+      </w:pPr>
+      <w:r>
+        <w:rPr>
+          <w:b/>
+          <w:i w:val="0"/>
+        </w:rPr>
+        <w:t>What to say</w:t>
+      </w:r>
+    </w:p>
+    <w:p>
+      <w:pPr>
+        <w:shd w:val="clear" w:color="auto" w:fill="EEF1F5"/>
+      </w:pPr>
+      <w:r>
+        <w:rPr>
+          <w:b w:val="0"/>
+          <w:i w:val="0"/>
+        </w:rPr>
+        <w:t>"The estimator opens the PDF plans in the browser and measures with the mouse, in feet and inches. One measurement of a wall becomes every material and the labor hours — and every number shows its math. The suppliers get their lists in one click, and the proposal is priced from your own costs and markups. Cost and profit never leave the company."</w:t>
+      </w:r>
+    </w:p>
+    <w:p>
+      <w:r>
+        <w:rPr>
+          <w:b w:val="0"/>
+          <w:i w:val="0"/>
+        </w:rPr>
+        <w:t xml:space="preserve">Full details: </w:t>
+      </w:r>
+      <w:r>
+        <w:rPr>
+          <w:b w:val="0"/>
+          <w:i w:val="0"/>
+        </w:rPr>
+        <w:t>Measure user manual</w:t>
+      </w:r>
+      <w:r>
+        <w:rPr>
+          <w:b w:val="0"/>
+          <w:i w:val="0"/>
+        </w:rPr>
+        <w:t>.</w:t>
+      </w:r>
+    </w:p>
+    <w:p>
+      <w:pPr>
+        <w:pStyle w:val="Heading2"/>
+      </w:pPr>
+      <w:r>
+        <w:rPr>
+          <w:b w:val="0"/>
+          <w:i w:val="0"/>
+        </w:rPr>
+        <w:t>Act 8 — The other modules (optional)</w:t>
+      </w:r>
+    </w:p>
+    <w:p>
+      <w:r>
+        <w:rPr>
+          <w:b w:val="0"/>
+          <w:i w:val="0"/>
+        </w:rPr>
+        <w:t>Detailed scripts for Settings will be added to this guide. Meanwhile, the highlights:</w:t>
       </w:r>
     </w:p>
     <w:p>
@@ -3435,14 +4021,14 @@
           <w:b/>
           <w:i w:val="0"/>
         </w:rPr>
-        <w:t>Measure</w:t>
+        <w:t>Measure, more</w:t>
       </w:r>
       <w:r>
         <w:rPr>
           <w:b w:val="0"/>
           <w:i w:val="0"/>
         </w:rPr>
-        <w:t xml:space="preserve"> — sign in as </w:t>
+        <w:t xml:space="preserve"> — as </w:t>
       </w:r>
       <w:r>
         <w:rPr>
@@ -3456,35 +4042,35 @@
           <w:b w:val="0"/>
           <w:i w:val="0"/>
         </w:rPr>
-        <w:t xml:space="preserve">, open a project, then a sheet: set the scale, measure walls and floors on the PDF plan, and see the materials and labor calculated by the assemblies; then the </w:t>
+        <w:t xml:space="preserve">: the elevations (siding with the gable, windows and doors deducted, the </w:t>
       </w:r>
       <w:r>
         <w:rPr>
           <w:b/>
           <w:i w:val="0"/>
         </w:rPr>
-        <w:t>Material list for quotes</w:t>
+        <w:t>Opening</w:t>
       </w:r>
       <w:r>
         <w:rPr>
           <w:b w:val="0"/>
           <w:i w:val="0"/>
         </w:rPr>
-        <w:t xml:space="preserve"> and the </w:t>
+        <w:t xml:space="preserve"> tool) and the </w:t>
       </w:r>
       <w:r>
         <w:rPr>
           <w:b/>
           <w:i w:val="0"/>
         </w:rPr>
-        <w:t>Proposal</w:t>
+        <w:t>Elm Row Townhouses</w:t>
       </w:r>
       <w:r>
         <w:rPr>
           <w:b w:val="0"/>
           <w:i w:val="0"/>
         </w:rPr>
-        <w:t>.</w:t>
+        <w:t xml:space="preserve"> project, where one unit plan is measured once and counts × 6.</w:t>
       </w:r>
     </w:p>
     <w:p>
@@ -4363,6 +4949,12 @@
       <w:startOverride w:val="1"/>
     </w:lvlOverride>
   </w:num>
+  <w:num w:numId="18">
+    <w:abstractNumId w:val="7"/>
+    <w:lvlOverride w:ilvl="0">
+      <w:startOverride w:val="1"/>
+    </w:lvlOverride>
+  </w:num>
 </w:numbering>
 </file>
 

</xml_diff>

<commit_message>
Portal: módulo Settings (inglês), com obras, cronograma e contatos
- Visão geral, manual (funcionários e valor hora, encargos, jornada,
  empresa, contatos, obras e modelos de etapas, cronograma com linha de
  base, % pelo diário e publicação para a construtora, usuários, perfis,
  auditoria), regras SET-001 a 065, catálogo de permissões e o que ainda
  é simulado ou fixo no código
- 24 capturas novas (Sandra, Tom e Ana)
- Guia do apresentador: ato 8 (Settings e cronograma) e ato 9 opcional;
  apresentação completa em cerca de 40 minutos

Co-Authored-By: Claude Opus 5.5 <noreply@anthropic.com>
Claude-Session: https://claude.ai/code/session_01Ep8bJsuQq2bqGePCMzzux2
</commit_message>
<xml_diff>
--- a/portal/files/KORbuild - Presenters guide.docx
+++ b/portal/files/KORbuild - Presenters guide.docx
@@ -34,21 +34,21 @@
           <w:b w:val="0"/>
           <w:i w:val="0"/>
         </w:rPr>
-        <w:t xml:space="preserve">This guide is for the person who will present KORbuild to a customer. You do not need to know the system beforehand: follow the order below, sign in with the users indicated, and use the "what to say" boxes as your script. A presentation of Daily, Crew and Measure takes about </w:t>
+        <w:t xml:space="preserve">This guide is for the person who will present KORbuild to a customer. You do not need to know the system beforehand: follow the order below, sign in with the users indicated, and use the "what to say" boxes as your script. The full presentation — Daily, Crew, Measure and Settings — takes about </w:t>
       </w:r>
       <w:r>
         <w:rPr>
           <w:b/>
           <w:i w:val="0"/>
         </w:rPr>
-        <w:t>35 minutes</w:t>
+        <w:t>40 minutes</w:t>
       </w:r>
       <w:r>
         <w:rPr>
           <w:b w:val="0"/>
           <w:i w:val="0"/>
         </w:rPr>
-        <w:t>; with questions, plan for 50.</w:t>
+        <w:t>; with questions, plan for an hour. For a shorter meeting, pick the acts that matter to the customer.</w:t>
       </w:r>
     </w:p>
     <w:p>
@@ -4000,16 +4000,488 @@
           <w:b w:val="0"/>
           <w:i w:val="0"/>
         </w:rPr>
-        <w:t>Act 8 — The other modules (optional)</w:t>
+        <w:t>Act 8 — Settings and the job schedule (5 min)</w:t>
       </w:r>
     </w:p>
     <w:p>
+      <w:pPr>
+        <w:pStyle w:val="ListNumber"/>
+        <w:numPr>
+          <w:ilvl w:val="0"/>
+          <w:numId w:val="19"/>
+        </w:numPr>
+      </w:pPr>
       <w:r>
         <w:rPr>
           <w:b w:val="0"/>
           <w:i w:val="0"/>
         </w:rPr>
-        <w:t>Detailed scripts for Settings will be added to this guide. Meanwhile, the highlights:</w:t>
+        <w:t xml:space="preserve">Sign in as </w:t>
+      </w:r>
+      <w:r>
+        <w:rPr>
+          <w:b/>
+          <w:i w:val="0"/>
+        </w:rPr>
+        <w:t>Sandra Lopes</w:t>
+      </w:r>
+      <w:r>
+        <w:rPr>
+          <w:b w:val="0"/>
+          <w:i w:val="0"/>
+        </w:rPr>
+        <w:t xml:space="preserve"> (Ridgeline), open </w:t>
+      </w:r>
+      <w:r>
+        <w:rPr>
+          <w:b/>
+          <w:i w:val="0"/>
+        </w:rPr>
+        <w:t>Settings</w:t>
+      </w:r>
+      <w:r>
+        <w:rPr>
+          <w:b w:val="0"/>
+          <w:i w:val="0"/>
+        </w:rPr>
+        <w:t xml:space="preserve">. Open </w:t>
+      </w:r>
+      <w:r>
+        <w:rPr>
+          <w:b/>
+          <w:i w:val="0"/>
+        </w:rPr>
+        <w:t>Employees</w:t>
+      </w:r>
+      <w:r>
+        <w:rPr>
+          <w:b w:val="0"/>
+          <w:i w:val="0"/>
+        </w:rPr>
+        <w:t xml:space="preserve"> › </w:t>
+      </w:r>
+      <w:r>
+        <w:rPr>
+          <w:b/>
+          <w:i w:val="0"/>
+        </w:rPr>
+        <w:t>Carlos Mendes</w:t>
+      </w:r>
+      <w:r>
+        <w:rPr>
+          <w:b w:val="0"/>
+          <w:i w:val="0"/>
+        </w:rPr>
+        <w:t>: the employer company, the current hourly rate, overtime and burdened cost, certifications about to expire.</w:t>
+      </w:r>
+    </w:p>
+    <w:p>
+      <w:pPr>
+        <w:pStyle w:val="ListNumber"/>
+        <w:numPr>
+          <w:ilvl w:val="0"/>
+          <w:numId w:val="19"/>
+        </w:numPr>
+      </w:pPr>
+      <w:r>
+        <w:rPr>
+          <w:b w:val="0"/>
+          <w:i w:val="0"/>
+        </w:rPr>
+        <w:t xml:space="preserve">Click </w:t>
+      </w:r>
+      <w:r>
+        <w:rPr>
+          <w:b/>
+          <w:i w:val="0"/>
+        </w:rPr>
+        <w:t>Change hourly rate</w:t>
+      </w:r>
+      <w:r>
+        <w:rPr>
+          <w:b w:val="0"/>
+          <w:i w:val="0"/>
+        </w:rPr>
+        <w:t xml:space="preserve"> to show that a raise applies </w:t>
+      </w:r>
+      <w:r>
+        <w:rPr>
+          <w:b/>
+          <w:i w:val="0"/>
+        </w:rPr>
+        <w:t>from a date</w:t>
+      </w:r>
+      <w:r>
+        <w:rPr>
+          <w:b w:val="0"/>
+          <w:i w:val="0"/>
+        </w:rPr>
+        <w:t>: the hourly rate history keeps every rate, and approved weeks never change. (Cancel it.)</w:t>
+      </w:r>
+    </w:p>
+    <w:p>
+      <w:pPr>
+        <w:jc w:val="center"/>
+      </w:pPr>
+      <w:r>
+        <w:drawing>
+          <wp:inline xmlns:a="http://schemas.openxmlformats.org/drawingml/2006/main" xmlns:pic="http://schemas.openxmlformats.org/drawingml/2006/picture">
+            <wp:extent cx="5760000" cy="3440000"/>
+            <wp:docPr id="13" name="Picture 13"/>
+            <wp:cNvGraphicFramePr>
+              <a:graphicFrameLocks noChangeAspect="1"/>
+            </wp:cNvGraphicFramePr>
+            <a:graphic>
+              <a:graphicData uri="http://schemas.openxmlformats.org/drawingml/2006/picture">
+                <pic:pic>
+                  <pic:nvPicPr>
+                    <pic:cNvPr id="0" name="settings-employee.png"/>
+                    <pic:cNvPicPr/>
+                  </pic:nvPicPr>
+                  <pic:blipFill>
+                    <a:blip r:embed="rId21"/>
+                    <a:stretch>
+                      <a:fillRect/>
+                    </a:stretch>
+                  </pic:blipFill>
+                  <pic:spPr>
+                    <a:xfrm>
+                      <a:off x="0" y="0"/>
+                      <a:ext cx="5760000" cy="3440000"/>
+                    </a:xfrm>
+                    <a:prstGeom prst="rect"/>
+                  </pic:spPr>
+                </pic:pic>
+              </a:graphicData>
+            </a:graphic>
+          </wp:inline>
+        </w:drawing>
+      </w:r>
+    </w:p>
+    <w:p>
+      <w:pPr>
+        <w:jc w:val="center"/>
+      </w:pPr>
+      <w:r>
+        <w:rPr>
+          <w:b w:val="0"/>
+          <w:i/>
+        </w:rPr>
+        <w:t>An employee, with the hourly rate cards</w:t>
+      </w:r>
+    </w:p>
+    <w:p>
+      <w:pPr>
+        <w:pStyle w:val="ListNumber"/>
+        <w:numPr>
+          <w:ilvl w:val="0"/>
+          <w:numId w:val="19"/>
+        </w:numPr>
+      </w:pPr>
+      <w:r>
+        <w:rPr>
+          <w:b w:val="0"/>
+          <w:i w:val="0"/>
+        </w:rPr>
+        <w:t xml:space="preserve">Open </w:t>
+      </w:r>
+      <w:r>
+        <w:rPr>
+          <w:b/>
+          <w:i w:val="0"/>
+        </w:rPr>
+        <w:t>Labor burden</w:t>
+      </w:r>
+      <w:r>
+        <w:rPr>
+          <w:b w:val="0"/>
+          <w:i w:val="0"/>
+        </w:rPr>
+        <w:t xml:space="preserve"> and </w:t>
+      </w:r>
+      <w:r>
+        <w:rPr>
+          <w:b/>
+          <w:i w:val="0"/>
+        </w:rPr>
+        <w:t>Work rules</w:t>
+      </w:r>
+      <w:r>
+        <w:rPr>
+          <w:b w:val="0"/>
+          <w:i w:val="0"/>
+        </w:rPr>
+        <w:t>: versions with effective dates — the New Hampshire rule, overtime over 40 hours, 30-minute break after 5 hours — and the history.</w:t>
+      </w:r>
+    </w:p>
+    <w:p>
+      <w:pPr>
+        <w:pStyle w:val="ListNumber"/>
+        <w:numPr>
+          <w:ilvl w:val="0"/>
+          <w:numId w:val="19"/>
+        </w:numPr>
+      </w:pPr>
+      <w:r>
+        <w:rPr>
+          <w:b w:val="0"/>
+          <w:i w:val="0"/>
+        </w:rPr>
+        <w:t xml:space="preserve">Open </w:t>
+      </w:r>
+      <w:r>
+        <w:rPr>
+          <w:b/>
+          <w:i w:val="0"/>
+        </w:rPr>
+        <w:t>Roles</w:t>
+      </w:r>
+      <w:r>
+        <w:rPr>
+          <w:b w:val="0"/>
+          <w:i w:val="0"/>
+        </w:rPr>
+        <w:t xml:space="preserve">: the permission matrix. Point out </w:t>
+      </w:r>
+      <w:r>
+        <w:rPr>
+          <w:b/>
+          <w:i w:val="0"/>
+        </w:rPr>
+        <w:t>See costs and dollar amounts</w:t>
+      </w:r>
+      <w:r>
+        <w:rPr>
+          <w:b w:val="0"/>
+          <w:i w:val="0"/>
+        </w:rPr>
+        <w:t>, separate from approving hours.</w:t>
+      </w:r>
+    </w:p>
+    <w:p>
+      <w:pPr>
+        <w:pStyle w:val="ListNumber"/>
+        <w:numPr>
+          <w:ilvl w:val="0"/>
+          <w:numId w:val="19"/>
+        </w:numPr>
+      </w:pPr>
+      <w:r>
+        <w:rPr>
+          <w:b w:val="0"/>
+          <w:i w:val="0"/>
+        </w:rPr>
+        <w:t xml:space="preserve">Sign in as </w:t>
+      </w:r>
+      <w:r>
+        <w:rPr>
+          <w:b/>
+          <w:i w:val="0"/>
+        </w:rPr>
+        <w:t>Tom Reilly</w:t>
+      </w:r>
+      <w:r>
+        <w:rPr>
+          <w:b w:val="0"/>
+          <w:i w:val="0"/>
+        </w:rPr>
+        <w:t xml:space="preserve"> (Northfield) and open Daily › Jobs › </w:t>
+      </w:r>
+      <w:r>
+        <w:rPr>
+          <w:b/>
+          <w:i w:val="0"/>
+        </w:rPr>
+        <w:t>Maple Gardens Residences · framing and siding</w:t>
+      </w:r>
+      <w:r>
+        <w:rPr>
+          <w:b w:val="0"/>
+          <w:i w:val="0"/>
+        </w:rPr>
+        <w:t xml:space="preserve"> › </w:t>
+      </w:r>
+      <w:r>
+        <w:rPr>
+          <w:b/>
+          <w:i w:val="0"/>
+        </w:rPr>
+        <w:t>Open schedule</w:t>
+      </w:r>
+      <w:r>
+        <w:rPr>
+          <w:b w:val="0"/>
+          <w:i w:val="0"/>
+        </w:rPr>
+        <w:t>: actual vs. planned progress, a task behind, the forecast finish against the baseline, the Gantt with the baseline bars.</w:t>
+      </w:r>
+    </w:p>
+    <w:p>
+      <w:pPr>
+        <w:jc w:val="center"/>
+      </w:pPr>
+      <w:r>
+        <w:drawing>
+          <wp:inline xmlns:a="http://schemas.openxmlformats.org/drawingml/2006/main" xmlns:pic="http://schemas.openxmlformats.org/drawingml/2006/picture">
+            <wp:extent cx="5760000" cy="3440000"/>
+            <wp:docPr id="14" name="Picture 14"/>
+            <wp:cNvGraphicFramePr>
+              <a:graphicFrameLocks noChangeAspect="1"/>
+            </wp:cNvGraphicFramePr>
+            <a:graphic>
+              <a:graphicData uri="http://schemas.openxmlformats.org/drawingml/2006/picture">
+                <pic:pic>
+                  <pic:nvPicPr>
+                    <pic:cNvPr id="0" name="schedule-gantt.png"/>
+                    <pic:cNvPicPr/>
+                  </pic:nvPicPr>
+                  <pic:blipFill>
+                    <a:blip r:embed="rId22"/>
+                    <a:stretch>
+                      <a:fillRect/>
+                    </a:stretch>
+                  </pic:blipFill>
+                  <pic:spPr>
+                    <a:xfrm>
+                      <a:off x="0" y="0"/>
+                      <a:ext cx="5760000" cy="3440000"/>
+                    </a:xfrm>
+                    <a:prstGeom prst="rect"/>
+                  </pic:spPr>
+                </pic:pic>
+              </a:graphicData>
+            </a:graphic>
+          </wp:inline>
+        </w:drawing>
+      </w:r>
+    </w:p>
+    <w:p>
+      <w:pPr>
+        <w:jc w:val="center"/>
+      </w:pPr>
+      <w:r>
+        <w:rPr>
+          <w:b w:val="0"/>
+          <w:i/>
+        </w:rPr>
+        <w:t>The job schedule</w:t>
+      </w:r>
+    </w:p>
+    <w:p>
+      <w:pPr>
+        <w:pStyle w:val="ListNumber"/>
+        <w:numPr>
+          <w:ilvl w:val="0"/>
+          <w:numId w:val="19"/>
+        </w:numPr>
+      </w:pPr>
+      <w:r>
+        <w:rPr>
+          <w:b w:val="0"/>
+          <w:i w:val="0"/>
+        </w:rPr>
+        <w:t xml:space="preserve">Show </w:t>
+      </w:r>
+      <w:r>
+        <w:rPr>
+          <w:b/>
+          <w:i w:val="0"/>
+        </w:rPr>
+        <w:t>Publish to client</w:t>
+      </w:r>
+      <w:r>
+        <w:rPr>
+          <w:b w:val="0"/>
+          <w:i w:val="0"/>
+        </w:rPr>
+        <w:t xml:space="preserve">, then sign in as </w:t>
+      </w:r>
+      <w:r>
+        <w:rPr>
+          <w:b/>
+          <w:i w:val="0"/>
+        </w:rPr>
+        <w:t>Ana</w:t>
+      </w:r>
+      <w:r>
+        <w:rPr>
+          <w:b w:val="0"/>
+          <w:i w:val="0"/>
+        </w:rPr>
+        <w:t xml:space="preserve"> and open the same job: the published version, read-only, with </w:t>
+      </w:r>
+      <w:r>
+        <w:rPr>
+          <w:b/>
+          <w:i w:val="0"/>
+        </w:rPr>
+        <w:t>Export to Excel</w:t>
+      </w:r>
+      <w:r>
+        <w:rPr>
+          <w:b w:val="0"/>
+          <w:i w:val="0"/>
+        </w:rPr>
+        <w:t>.</w:t>
+      </w:r>
+    </w:p>
+    <w:p>
+      <w:pPr>
+        <w:shd w:val="clear" w:color="auto" w:fill="EEF1F5"/>
+      </w:pPr>
+      <w:r>
+        <w:rPr>
+          <w:b/>
+          <w:i w:val="0"/>
+        </w:rPr>
+        <w:t>What to say</w:t>
+      </w:r>
+    </w:p>
+    <w:p>
+      <w:pPr>
+        <w:shd w:val="clear" w:color="auto" w:fill="EEF1F5"/>
+      </w:pPr>
+      <w:r>
+        <w:rPr>
+          <w:b w:val="0"/>
+          <w:i w:val="0"/>
+        </w:rPr>
+        <w:t>"Everything the company may want to change lives here — rates, burden, overtime rules, who can do what — and nothing rewrites the past: a raise applies from a date, and last week's payroll stays as it was. The schedule belongs to the job: the progress comes from the approved daily reports, and the sub decides when the general contractor sees a new version."</w:t>
+      </w:r>
+    </w:p>
+    <w:p>
+      <w:r>
+        <w:rPr>
+          <w:b w:val="0"/>
+          <w:i w:val="0"/>
+        </w:rPr>
+        <w:t xml:space="preserve">Full details: </w:t>
+      </w:r>
+      <w:r>
+        <w:rPr>
+          <w:b w:val="0"/>
+          <w:i w:val="0"/>
+        </w:rPr>
+        <w:t>Settings user manual</w:t>
+      </w:r>
+      <w:r>
+        <w:rPr>
+          <w:b w:val="0"/>
+          <w:i w:val="0"/>
+        </w:rPr>
+        <w:t>.</w:t>
+      </w:r>
+    </w:p>
+    <w:p>
+      <w:pPr>
+        <w:pStyle w:val="Heading2"/>
+      </w:pPr>
+      <w:r>
+        <w:rPr>
+          <w:b w:val="0"/>
+          <w:i w:val="0"/>
+        </w:rPr>
+        <w:t>Act 9 — More to show (optional)</w:t>
       </w:r>
     </w:p>
     <w:p>
@@ -4082,7 +4554,7 @@
           <w:b/>
           <w:i w:val="0"/>
         </w:rPr>
-        <w:t>Job schedule</w:t>
+        <w:t>A sub on its own</w:t>
       </w:r>
       <w:r>
         <w:rPr>
@@ -4103,21 +4575,21 @@
           <w:b w:val="0"/>
           <w:i w:val="0"/>
         </w:rPr>
-        <w:t xml:space="preserve">, Daily › Jobs › Maple Gardens Residences › </w:t>
+        <w:t xml:space="preserve">, Daily › Jobs › </w:t>
       </w:r>
       <w:r>
         <w:rPr>
           <w:b/>
           <w:i w:val="0"/>
         </w:rPr>
-        <w:t>Open schedule</w:t>
+        <w:t>Thompson residence</w:t>
       </w:r>
       <w:r>
         <w:rPr>
           <w:b w:val="0"/>
           <w:i w:val="0"/>
         </w:rPr>
-        <w:t>: Gantt chart, baseline, progress from the daily reports, export to Excel and publish to the GC.</w:t>
+        <w:t>: a homeowner job with no general contractor. Here Northfield approves its own reports.</w:t>
       </w:r>
     </w:p>
     <w:p>
@@ -4129,7 +4601,7 @@
           <w:b/>
           <w:i w:val="0"/>
         </w:rPr>
-        <w:t>Settings</w:t>
+        <w:t>The general contractor's Settings</w:t>
       </w:r>
       <w:r>
         <w:rPr>
@@ -4143,75 +4615,14 @@
           <w:b/>
           <w:i w:val="0"/>
         </w:rPr>
-        <w:t>Sandra</w:t>
+        <w:t>Ana</w:t>
       </w:r>
       <w:r>
         <w:rPr>
           <w:b w:val="0"/>
           <w:i w:val="0"/>
         </w:rPr>
-        <w:t xml:space="preserve">: employees (with the employer company), hourly rate history, labor burden, work rules, jobs, users and access roles, audit log. As </w:t>
-      </w:r>
-      <w:r>
-        <w:rPr>
-          <w:b/>
-          <w:i w:val="0"/>
-        </w:rPr>
-        <w:t>Ana</w:t>
-      </w:r>
-      <w:r>
-        <w:rPr>
-          <w:b w:val="0"/>
-          <w:i w:val="0"/>
-        </w:rPr>
-        <w:t>, the general contractor's Settings is lighter: jobs (with their subcontractors), contacts, users and roles.</w:t>
-      </w:r>
-    </w:p>
-    <w:p>
-      <w:pPr>
-        <w:pStyle w:val="ListBullet"/>
-      </w:pPr>
-      <w:r>
-        <w:rPr>
-          <w:b/>
-          <w:i w:val="0"/>
-        </w:rPr>
-        <w:t>A sub on its own</w:t>
-      </w:r>
-      <w:r>
-        <w:rPr>
-          <w:b w:val="0"/>
-          <w:i w:val="0"/>
-        </w:rPr>
-        <w:t xml:space="preserve"> — as </w:t>
-      </w:r>
-      <w:r>
-        <w:rPr>
-          <w:b/>
-          <w:i w:val="0"/>
-        </w:rPr>
-        <w:t>Tom</w:t>
-      </w:r>
-      <w:r>
-        <w:rPr>
-          <w:b w:val="0"/>
-          <w:i w:val="0"/>
-        </w:rPr>
-        <w:t xml:space="preserve">, Daily › Jobs › </w:t>
-      </w:r>
-      <w:r>
-        <w:rPr>
-          <w:b/>
-          <w:i w:val="0"/>
-        </w:rPr>
-        <w:t>Thompson residence</w:t>
-      </w:r>
-      <w:r>
-        <w:rPr>
-          <w:b w:val="0"/>
-          <w:i w:val="0"/>
-        </w:rPr>
-        <w:t>: a homeowner job with no general contractor. Here Northfield approves its own reports.</w:t>
+        <w:t>: jobs with their subcontractors, contacts, users and roles; no labor burden or work rules, because the general contractor does not clock anyone in.</w:t>
       </w:r>
     </w:p>
     <w:p>
@@ -4955,6 +5366,12 @@
       <w:startOverride w:val="1"/>
     </w:lvlOverride>
   </w:num>
+  <w:num w:numId="19">
+    <w:abstractNumId w:val="7"/>
+    <w:lvlOverride w:ilvl="0">
+      <w:startOverride w:val="1"/>
+    </w:lvlOverride>
+  </w:num>
 </w:numbering>
 </file>
 

</xml_diff>

<commit_message>
Concorrências no portal: módulo Bids (EN e PT) e o ato no guia do apresentador
- 5 páginas por idioma: visão geral, manual com capturas, regras CO-nnn, perfis e permissões, situação do protótipo
- 13 capturas por idioma tiradas do protótipo (lista, nova, convidados, perguntas, comparar, fechar, convites, link, quarteirização)
- ato 9 do guia do apresentador e duas perguntas dos clientes; nome do módulo traduzido no portal em PT
- teste do portal com o módulo novo (78)

Co-Authored-By: Claude Opus 5.5 <noreply@anthropic.com>
Claude-Session: https://claude.ai/code/session_01Ep8bJsuQq2bqGePCMzzux2
</commit_message>
<xml_diff>
--- a/portal/files/KORbuild - Presenters guide.docx
+++ b/portal/files/KORbuild - Presenters guide.docx
@@ -361,6 +361,56 @@
                 <w:sz w:val="18"/>
               </w:rPr>
               <w:t>Office administrator</w:t>
+            </w:r>
+          </w:p>
+        </w:tc>
+      </w:tr>
+      <w:tr>
+        <w:tc>
+          <w:tcPr>
+            <w:tcW w:type="dxa" w:w="3249"/>
+          </w:tcPr>
+          <w:p>
+            <w:r/>
+            <w:r>
+              <w:rPr>
+                <w:b/>
+                <w:i w:val="0"/>
+                <w:sz w:val="18"/>
+              </w:rPr>
+              <w:t>Bids</w:t>
+            </w:r>
+          </w:p>
+        </w:tc>
+        <w:tc>
+          <w:tcPr>
+            <w:tcW w:type="dxa" w:w="3249"/>
+          </w:tcPr>
+          <w:p>
+            <w:r/>
+            <w:r>
+              <w:rPr>
+                <w:b w:val="0"/>
+                <w:i w:val="0"/>
+                <w:sz w:val="18"/>
+              </w:rPr>
+              <w:t>Invitations to bid between companies: package, leveling, award, a channel that becomes the job conversation, subcontracting.</w:t>
+            </w:r>
+          </w:p>
+        </w:tc>
+        <w:tc>
+          <w:tcPr>
+            <w:tcW w:type="dxa" w:w="3249"/>
+          </w:tcPr>
+          <w:p>
+            <w:r/>
+            <w:r>
+              <w:rPr>
+                <w:b w:val="0"/>
+                <w:i w:val="0"/>
+                <w:sz w:val="18"/>
+              </w:rPr>
+              <w:t>The contracting company's office; subcontractors (Measure or a link)</w:t>
             </w:r>
           </w:p>
         </w:tc>
@@ -4481,7 +4531,576 @@
           <w:b w:val="0"/>
           <w:i w:val="0"/>
         </w:rPr>
-        <w:t>Act 9 — More to show (optional)</w:t>
+        <w:t>Act 9 — Bids: from the invitation to the job link (6 min)</w:t>
+      </w:r>
+    </w:p>
+    <w:p>
+      <w:pPr>
+        <w:pStyle w:val="ListNumber"/>
+        <w:numPr>
+          <w:ilvl w:val="0"/>
+          <w:numId w:val="20"/>
+        </w:numPr>
+      </w:pPr>
+      <w:r>
+        <w:rPr>
+          <w:b w:val="0"/>
+          <w:i w:val="0"/>
+        </w:rPr>
+        <w:t xml:space="preserve">Sign in as </w:t>
+      </w:r>
+      <w:r>
+        <w:rPr>
+          <w:b/>
+          <w:i w:val="0"/>
+        </w:rPr>
+        <w:t>Ana Ribeiro</w:t>
+      </w:r>
+      <w:r>
+        <w:rPr>
+          <w:b w:val="0"/>
+          <w:i w:val="0"/>
+        </w:rPr>
+        <w:t xml:space="preserve"> and open </w:t>
+      </w:r>
+      <w:r>
+        <w:rPr>
+          <w:b/>
+          <w:i w:val="0"/>
+        </w:rPr>
+        <w:t>Daily › Bids</w:t>
+      </w:r>
+      <w:r>
+        <w:rPr>
+          <w:b w:val="0"/>
+          <w:i w:val="0"/>
+        </w:rPr>
+        <w:t xml:space="preserve">: </w:t>
+      </w:r>
+      <w:r>
+        <w:rPr>
+          <w:b w:val="0"/>
+          <w:i/>
+        </w:rPr>
+        <w:t>Framing and drywall</w:t>
+      </w:r>
+      <w:r>
+        <w:rPr>
+          <w:b w:val="0"/>
+          <w:i w:val="0"/>
+        </w:rPr>
+        <w:t xml:space="preserve"> on the </w:t>
+      </w:r>
+      <w:r>
+        <w:rPr>
+          <w:b/>
+          <w:i w:val="0"/>
+        </w:rPr>
+        <w:t>Atlantic Tower</w:t>
+      </w:r>
+      <w:r>
+        <w:rPr>
+          <w:b w:val="0"/>
+          <w:i w:val="0"/>
+        </w:rPr>
+        <w:t>, open, due in 5 days.</w:t>
+      </w:r>
+    </w:p>
+    <w:p>
+      <w:pPr>
+        <w:pStyle w:val="ListNumber"/>
+        <w:numPr>
+          <w:ilvl w:val="0"/>
+          <w:numId w:val="20"/>
+        </w:numPr>
+      </w:pPr>
+      <w:r>
+        <w:rPr>
+          <w:b w:val="0"/>
+          <w:i w:val="0"/>
+        </w:rPr>
+        <w:t xml:space="preserve">Open it. </w:t>
+      </w:r>
+      <w:r>
+        <w:rPr>
+          <w:b/>
+          <w:i w:val="0"/>
+        </w:rPr>
+        <w:t>Invitees</w:t>
+      </w:r>
+      <w:r>
+        <w:rPr>
+          <w:b w:val="0"/>
+          <w:i w:val="0"/>
+        </w:rPr>
+        <w:t>: Northfield (on KORbuild) and Bayside (by link) bid; Pine Ridge declined, with the reason.</w:t>
+      </w:r>
+    </w:p>
+    <w:p>
+      <w:pPr>
+        <w:pStyle w:val="ListNumber"/>
+        <w:numPr>
+          <w:ilvl w:val="0"/>
+          <w:numId w:val="20"/>
+        </w:numPr>
+      </w:pPr>
+      <w:r>
+        <w:rPr>
+          <w:b/>
+          <w:i w:val="0"/>
+        </w:rPr>
+        <w:t>Questions</w:t>
+      </w:r>
+      <w:r>
+        <w:rPr>
+          <w:b w:val="0"/>
+          <w:i w:val="0"/>
+        </w:rPr>
+        <w:t xml:space="preserve">: Bayside asked about scaffolding and Ana answered </w:t>
+      </w:r>
+      <w:r>
+        <w:rPr>
+          <w:b/>
+          <w:i w:val="0"/>
+        </w:rPr>
+        <w:t>to all</w:t>
+      </w:r>
+      <w:r>
+        <w:rPr>
+          <w:b w:val="0"/>
+          <w:i w:val="0"/>
+        </w:rPr>
+        <w:t xml:space="preserve"> — Northfield sees the question without knowing who asked. Northfield's own question was answered only to Northfield.</w:t>
+      </w:r>
+    </w:p>
+    <w:p>
+      <w:pPr>
+        <w:pStyle w:val="ListNumber"/>
+        <w:numPr>
+          <w:ilvl w:val="0"/>
+          <w:numId w:val="20"/>
+        </w:numPr>
+      </w:pPr>
+      <w:r>
+        <w:rPr>
+          <w:b/>
+          <w:i w:val="0"/>
+        </w:rPr>
+        <w:t>Level bids</w:t>
+      </w:r>
+      <w:r>
+        <w:rPr>
+          <w:b w:val="0"/>
+          <w:i w:val="0"/>
+        </w:rPr>
+        <w:t xml:space="preserve">: one row per cost code next to the budget, the lowest in green, Bayside's framing </w:t>
+      </w:r>
+      <w:r>
+        <w:rPr>
+          <w:b w:val="0"/>
+          <w:i/>
+        </w:rPr>
+        <w:t>not bid</w:t>
+      </w:r>
+      <w:r>
+        <w:rPr>
+          <w:b w:val="0"/>
+          <w:i w:val="0"/>
+        </w:rPr>
+        <w:t xml:space="preserve"> (never zero), and the ⚠ on scaffolding: Bayside excluded something that is in the scope. Click </w:t>
+      </w:r>
+      <w:r>
+        <w:rPr>
+          <w:b/>
+          <w:i w:val="0"/>
+        </w:rPr>
+        <w:t>Award</w:t>
+      </w:r>
+      <w:r>
+        <w:rPr>
+          <w:b w:val="0"/>
+          <w:i w:val="0"/>
+        </w:rPr>
+        <w:t xml:space="preserve"> on Northfield to show the warnings, then cancel.</w:t>
+      </w:r>
+    </w:p>
+    <w:p>
+      <w:pPr>
+        <w:jc w:val="center"/>
+      </w:pPr>
+      <w:r>
+        <w:drawing>
+          <wp:inline xmlns:a="http://schemas.openxmlformats.org/drawingml/2006/main" xmlns:pic="http://schemas.openxmlformats.org/drawingml/2006/picture">
+            <wp:extent cx="5760000" cy="3600000"/>
+            <wp:docPr id="15" name="Picture 15"/>
+            <wp:cNvGraphicFramePr>
+              <a:graphicFrameLocks noChangeAspect="1"/>
+            </wp:cNvGraphicFramePr>
+            <a:graphic>
+              <a:graphicData uri="http://schemas.openxmlformats.org/drawingml/2006/picture">
+                <pic:pic>
+                  <pic:nvPicPr>
+                    <pic:cNvPr id="0" name="bids-leveling.png"/>
+                    <pic:cNvPicPr/>
+                  </pic:nvPicPr>
+                  <pic:blipFill>
+                    <a:blip r:embed="rId23"/>
+                    <a:stretch>
+                      <a:fillRect/>
+                    </a:stretch>
+                  </pic:blipFill>
+                  <pic:spPr>
+                    <a:xfrm>
+                      <a:off x="0" y="0"/>
+                      <a:ext cx="5760000" cy="3600000"/>
+                    </a:xfrm>
+                    <a:prstGeom prst="rect"/>
+                  </pic:spPr>
+                </pic:pic>
+              </a:graphicData>
+            </a:graphic>
+          </wp:inline>
+        </w:drawing>
+      </w:r>
+    </w:p>
+    <w:p>
+      <w:pPr>
+        <w:jc w:val="center"/>
+      </w:pPr>
+      <w:r>
+        <w:rPr>
+          <w:b w:val="0"/>
+          <w:i/>
+        </w:rPr>
+        <w:t>Leveling the bids</w:t>
+      </w:r>
+    </w:p>
+    <w:p>
+      <w:pPr>
+        <w:pStyle w:val="ListNumber"/>
+        <w:numPr>
+          <w:ilvl w:val="0"/>
+          <w:numId w:val="20"/>
+        </w:numPr>
+      </w:pPr>
+      <w:r>
+        <w:rPr>
+          <w:b w:val="0"/>
+          <w:i w:val="0"/>
+        </w:rPr>
+        <w:t xml:space="preserve">Sign in as </w:t>
+      </w:r>
+      <w:r>
+        <w:rPr>
+          <w:b/>
+          <w:i w:val="0"/>
+        </w:rPr>
+        <w:t>Tom Reilly</w:t>
+      </w:r>
+      <w:r>
+        <w:rPr>
+          <w:b w:val="0"/>
+          <w:i w:val="0"/>
+        </w:rPr>
+        <w:t xml:space="preserve"> and open </w:t>
+      </w:r>
+      <w:r>
+        <w:rPr>
+          <w:b/>
+          <w:i w:val="0"/>
+        </w:rPr>
+        <w:t>Measure › Invitations</w:t>
+      </w:r>
+      <w:r>
+        <w:rPr>
+          <w:b w:val="0"/>
+          <w:i w:val="0"/>
+        </w:rPr>
+        <w:t xml:space="preserve"> › </w:t>
+      </w:r>
+      <w:r>
+        <w:rPr>
+          <w:b w:val="0"/>
+          <w:i/>
+        </w:rPr>
+        <w:t>Framing and drywall</w:t>
+      </w:r>
+      <w:r>
+        <w:rPr>
+          <w:b w:val="0"/>
+          <w:i w:val="0"/>
+        </w:rPr>
+        <w:t xml:space="preserve">: the same package, nothing about the other invitees. </w:t>
+      </w:r>
+      <w:r>
+        <w:rPr>
+          <w:b/>
+          <w:i w:val="0"/>
+        </w:rPr>
+        <w:t>Create the project in Measure</w:t>
+      </w:r>
+      <w:r>
+        <w:rPr>
+          <w:b w:val="0"/>
+          <w:i w:val="0"/>
+        </w:rPr>
+        <w:t>: the project comes with the client, the address and the due date.</w:t>
+      </w:r>
+    </w:p>
+    <w:p>
+      <w:pPr>
+        <w:pStyle w:val="ListNumber"/>
+        <w:numPr>
+          <w:ilvl w:val="0"/>
+          <w:numId w:val="20"/>
+        </w:numPr>
+      </w:pPr>
+      <w:r>
+        <w:rPr>
+          <w:b w:val="0"/>
+          <w:i w:val="0"/>
+        </w:rPr>
+        <w:t xml:space="preserve">Open </w:t>
+      </w:r>
+      <w:r>
+        <w:rPr>
+          <w:b/>
+          <w:i w:val="0"/>
+        </w:rPr>
+        <w:t>Daily › Bids</w:t>
+      </w:r>
+      <w:r>
+        <w:rPr>
+          <w:b w:val="0"/>
+          <w:i w:val="0"/>
+        </w:rPr>
+        <w:t xml:space="preserve"> › </w:t>
+      </w:r>
+      <w:r>
+        <w:rPr>
+          <w:b w:val="0"/>
+          <w:i/>
+        </w:rPr>
+        <w:t>House drywall</w:t>
+      </w:r>
+      <w:r>
+        <w:rPr>
+          <w:b w:val="0"/>
+          <w:i w:val="0"/>
+        </w:rPr>
+        <w:t xml:space="preserve">: Northfield </w:t>
+      </w:r>
+      <w:r>
+        <w:rPr>
+          <w:b/>
+          <w:i w:val="0"/>
+        </w:rPr>
+        <w:t>subcontracts</w:t>
+      </w:r>
+      <w:r>
+        <w:rPr>
+          <w:b w:val="0"/>
+          <w:i w:val="0"/>
+        </w:rPr>
+        <w:t xml:space="preserve"> part of its Maple Gardens work to Bay State, which has no account.</w:t>
+      </w:r>
+    </w:p>
+    <w:p>
+      <w:pPr>
+        <w:pStyle w:val="ListNumber"/>
+        <w:numPr>
+          <w:ilvl w:val="0"/>
+          <w:numId w:val="20"/>
+        </w:numPr>
+      </w:pPr>
+      <w:r>
+        <w:rPr>
+          <w:b w:val="0"/>
+          <w:i w:val="0"/>
+        </w:rPr>
+        <w:t xml:space="preserve">Copy the link from </w:t>
+      </w:r>
+      <w:r>
+        <w:rPr>
+          <w:b/>
+          <w:i w:val="0"/>
+        </w:rPr>
+        <w:t>Invitees</w:t>
+      </w:r>
+      <w:r>
+        <w:rPr>
+          <w:b w:val="0"/>
+          <w:i w:val="0"/>
+        </w:rPr>
+        <w:t xml:space="preserve"> and open it in a private window: Bay State sees the invitation without signing in and submits its bid with the PDF.</w:t>
+      </w:r>
+    </w:p>
+    <w:p>
+      <w:pPr>
+        <w:jc w:val="center"/>
+      </w:pPr>
+      <w:r>
+        <w:drawing>
+          <wp:inline xmlns:a="http://schemas.openxmlformats.org/drawingml/2006/main" xmlns:pic="http://schemas.openxmlformats.org/drawingml/2006/picture">
+            <wp:extent cx="5760000" cy="3600000"/>
+            <wp:docPr id="16" name="Picture 16"/>
+            <wp:cNvGraphicFramePr>
+              <a:graphicFrameLocks noChangeAspect="1"/>
+            </wp:cNvGraphicFramePr>
+            <a:graphic>
+              <a:graphicData uri="http://schemas.openxmlformats.org/drawingml/2006/picture">
+                <pic:pic>
+                  <pic:nvPicPr>
+                    <pic:cNvPr id="0" name="bids-link.png"/>
+                    <pic:cNvPicPr/>
+                  </pic:nvPicPr>
+                  <pic:blipFill>
+                    <a:blip r:embed="rId24"/>
+                    <a:stretch>
+                      <a:fillRect/>
+                    </a:stretch>
+                  </pic:blipFill>
+                  <pic:spPr>
+                    <a:xfrm>
+                      <a:off x="0" y="0"/>
+                      <a:ext cx="5760000" cy="3600000"/>
+                    </a:xfrm>
+                    <a:prstGeom prst="rect"/>
+                  </pic:spPr>
+                </pic:pic>
+              </a:graphicData>
+            </a:graphic>
+          </wp:inline>
+        </w:drawing>
+      </w:r>
+    </w:p>
+    <w:p>
+      <w:pPr>
+        <w:jc w:val="center"/>
+      </w:pPr>
+      <w:r>
+        <w:rPr>
+          <w:b w:val="0"/>
+          <w:i/>
+        </w:rPr>
+        <w:t>The link page</w:t>
+      </w:r>
+    </w:p>
+    <w:p>
+      <w:pPr>
+        <w:pStyle w:val="ListNumber"/>
+        <w:numPr>
+          <w:ilvl w:val="0"/>
+          <w:numId w:val="20"/>
+        </w:numPr>
+      </w:pPr>
+      <w:r>
+        <w:rPr>
+          <w:b w:val="0"/>
+          <w:i w:val="0"/>
+        </w:rPr>
+        <w:t xml:space="preserve">Back as </w:t>
+      </w:r>
+      <w:r>
+        <w:rPr>
+          <w:b/>
+          <w:i w:val="0"/>
+        </w:rPr>
+        <w:t>Ana</w:t>
+      </w:r>
+      <w:r>
+        <w:rPr>
+          <w:b w:val="0"/>
+          <w:i w:val="0"/>
+        </w:rPr>
+        <w:t xml:space="preserve">, open the </w:t>
+      </w:r>
+      <w:r>
+        <w:rPr>
+          <w:b/>
+          <w:i w:val="0"/>
+        </w:rPr>
+        <w:t>Maple Gardens</w:t>
+      </w:r>
+      <w:r>
+        <w:rPr>
+          <w:b w:val="0"/>
+          <w:i w:val="0"/>
+        </w:rPr>
+        <w:t xml:space="preserve"> bid (awarded to Northfield) and the job page: the </w:t>
+      </w:r>
+      <w:r>
+        <w:rPr>
+          <w:b/>
+          <w:i w:val="0"/>
+        </w:rPr>
+        <w:t>channel</w:t>
+      </w:r>
+      <w:r>
+        <w:rPr>
+          <w:b w:val="0"/>
+          <w:i w:val="0"/>
+        </w:rPr>
+        <w:t xml:space="preserve"> with Northfield is the job conversation now.</w:t>
+      </w:r>
+    </w:p>
+    <w:p>
+      <w:pPr>
+        <w:shd w:val="clear" w:color="auto" w:fill="EEF1F5"/>
+      </w:pPr>
+      <w:r>
+        <w:rPr>
+          <w:b/>
+          <w:i w:val="0"/>
+        </w:rPr>
+        <w:t>What to say</w:t>
+      </w:r>
+    </w:p>
+    <w:p>
+      <w:pPr>
+        <w:shd w:val="clear" w:color="auto" w:fill="EEF1F5"/>
+      </w:pPr>
+      <w:r>
+        <w:rPr>
+          <w:b w:val="0"/>
+          <w:i w:val="0"/>
+        </w:rPr>
+        <w:t>"The bid is where the relationship starts. Each sub sees only its own invitation and its own numbers; you level by cost code and see what each one left out. When you award, the sub's job is created already linked to yours — daily reports, crew and schedule start flowing on day one. And a sub that isn't on KORbuild bids by a link, no account needed."</w:t>
+      </w:r>
+    </w:p>
+    <w:p>
+      <w:r>
+        <w:rPr>
+          <w:b w:val="0"/>
+          <w:i w:val="0"/>
+        </w:rPr>
+        <w:t xml:space="preserve">Full details: </w:t>
+      </w:r>
+      <w:r>
+        <w:rPr>
+          <w:b w:val="0"/>
+          <w:i w:val="0"/>
+        </w:rPr>
+        <w:t>Bids user manual</w:t>
+      </w:r>
+      <w:r>
+        <w:rPr>
+          <w:b w:val="0"/>
+          <w:i w:val="0"/>
+        </w:rPr>
+        <w:t>.</w:t>
+      </w:r>
+    </w:p>
+    <w:p>
+      <w:pPr>
+        <w:pStyle w:val="Heading2"/>
+      </w:pPr>
+      <w:r>
+        <w:rPr>
+          <w:b w:val="0"/>
+          <w:i w:val="0"/>
+        </w:rPr>
+        <w:t>Act 10 — More to show (optional)</w:t>
       </w:r>
     </w:p>
     <w:p>
@@ -5022,6 +5641,74 @@
                 <w:i w:val="0"/>
                 <w:sz w:val="18"/>
               </w:rPr>
+              <w:t>Can a sub see the other bids?</w:t>
+            </w:r>
+          </w:p>
+        </w:tc>
+        <w:tc>
+          <w:tcPr>
+            <w:tcW w:type="dxa" w:w="4873"/>
+          </w:tcPr>
+          <w:p>
+            <w:r/>
+            <w:r>
+              <w:rPr>
+                <w:b w:val="0"/>
+                <w:i w:val="0"/>
+                <w:sz w:val="18"/>
+              </w:rPr>
+              <w:t>No. Each invited company sees only its own invitation and bids — never who else was invited or the amounts. Losing bidders are told they weren't selected, without the winning amount.</w:t>
+            </w:r>
+          </w:p>
+        </w:tc>
+      </w:tr>
+      <w:tr>
+        <w:tc>
+          <w:tcPr>
+            <w:tcW w:type="dxa" w:w="4873"/>
+          </w:tcPr>
+          <w:p>
+            <w:r/>
+            <w:r>
+              <w:rPr>
+                <w:b w:val="0"/>
+                <w:i w:val="0"/>
+                <w:sz w:val="18"/>
+              </w:rPr>
+              <w:t>Can a subcontractor hire another one?</w:t>
+            </w:r>
+          </w:p>
+        </w:tc>
+        <w:tc>
+          <w:tcPr>
+            <w:tcW w:type="dxa" w:w="4873"/>
+          </w:tcPr>
+          <w:p>
+            <w:r/>
+            <w:r>
+              <w:rPr>
+                <w:b w:val="0"/>
+                <w:i w:val="0"/>
+                <w:sz w:val="18"/>
+              </w:rPr>
+              <w:t>Yes. It runs a bid the same way (while estimating or after winning). Whoever hired it can require approval; the general contractor sees the whole chain on site, without amounts.</w:t>
+            </w:r>
+          </w:p>
+        </w:tc>
+      </w:tr>
+      <w:tr>
+        <w:tc>
+          <w:tcPr>
+            <w:tcW w:type="dxa" w:w="4873"/>
+          </w:tcPr>
+          <w:p>
+            <w:r/>
+            <w:r>
+              <w:rPr>
+                <w:b w:val="0"/>
+                <w:i w:val="0"/>
+                <w:sz w:val="18"/>
+              </w:rPr>
               <w:t>Where is my data stored?</w:t>
             </w:r>
           </w:p>
@@ -5367,6 +6054,12 @@
     </w:lvlOverride>
   </w:num>
   <w:num w:numId="19">
+    <w:abstractNumId w:val="7"/>
+    <w:lvlOverride w:ilvl="0">
+      <w:startOverride w:val="1"/>
+    </w:lvlOverride>
+  </w:num>
+  <w:num w:numId="20">
     <w:abstractNumId w:val="7"/>
     <w:lvlOverride w:ilvl="0">
       <w:startOverride w:val="1"/>

</xml_diff>